<commit_message>
Master PRD v2.0: Add MN-INACTIVE (Activity Monitoring) as sixth MN process
- Added MN-INACTIVE to Process Tier Summary table (Core tier, between MN-ENGAGE and MN-CLOSE)
- Added MN-INACTIVE process entry in section 3.3 with description, business value, key capabilities
- Removed inactivity detection bullet from MN-ENGAGE Key Capabilities (now covered by MN-INACTIVE)
- Updated Last Updated to 03-30-26 21:00
- Updated CLAUDE.md target repo structure to reflect correct process order
</commit_message>
<xml_diff>
--- a/PRDs/CBM-Master-PRD.docx
+++ b/PRDs/CBM-Master-PRD.docx
@@ -256,7 +256,7 @@
                 <w:sz w:val="20"/>
                 <w:szCs w:val="20"/>
               </w:rPr>
-              <w:t xml:space="preserve">03-30-26 17:00</w:t>
+              <w:t xml:space="preserve">03-30-26 21:00</w:t>
             </w:r>
           </w:p>
         </w:tc>
@@ -5289,6 +5289,119 @@
                 <w:szCs w:val="20"/>
               </w:rPr>
               <w:t xml:space="preserve">Engagement Management</w:t>
+            </w:r>
+          </w:p>
+        </w:tc>
+        <w:tc>
+          <w:tcPr>
+            <w:tcW w:type="dxa" w:w="3960"/>
+            <w:tcBorders>
+              <w:top w:val="single" w:color="AAAAAA" w:sz="1"/>
+              <w:left w:val="single" w:color="AAAAAA" w:sz="1"/>
+              <w:bottom w:val="single" w:color="AAAAAA" w:sz="1"/>
+              <w:right w:val="single" w:color="AAAAAA" w:sz="1"/>
+            </w:tcBorders>
+            <w:tcMar>
+              <w:top w:type="dxa" w:w="60"/>
+              <w:left w:type="dxa" w:w="100"/>
+              <w:bottom w:type="dxa" w:w="60"/>
+              <w:right w:type="dxa" w:w="100"/>
+            </w:tcMar>
+          </w:tcPr>
+          <w:p>
+            <w:r>
+              <w:rPr>
+                <w:rFonts w:ascii="Arial" w:cs="Arial" w:eastAsia="Arial" w:hAnsi="Arial"/>
+                <w:sz w:val="20"/>
+                <w:szCs w:val="20"/>
+              </w:rPr>
+              <w:t xml:space="preserve">Mentoring (MN)</w:t>
+            </w:r>
+          </w:p>
+        </w:tc>
+        <w:tc>
+          <w:tcPr>
+            <w:tcW w:type="dxa" w:w="1800"/>
+            <w:tcBorders>
+              <w:top w:val="single" w:color="AAAAAA" w:sz="1"/>
+              <w:left w:val="single" w:color="AAAAAA" w:sz="1"/>
+              <w:bottom w:val="single" w:color="AAAAAA" w:sz="1"/>
+              <w:right w:val="single" w:color="AAAAAA" w:sz="1"/>
+            </w:tcBorders>
+            <w:shd w:fill="C6EFCE" w:val="clear"/>
+            <w:tcMar>
+              <w:top w:type="dxa" w:w="60"/>
+              <w:left w:type="dxa" w:w="100"/>
+              <w:bottom w:type="dxa" w:w="60"/>
+              <w:right w:type="dxa" w:w="100"/>
+            </w:tcMar>
+          </w:tcPr>
+          <w:p>
+            <w:r>
+              <w:rPr>
+                <w:rFonts w:ascii="Arial" w:cs="Arial" w:eastAsia="Arial" w:hAnsi="Arial"/>
+                <w:sz w:val="20"/>
+                <w:szCs w:val="20"/>
+              </w:rPr>
+              <w:t xml:space="preserve">Core</w:t>
+            </w:r>
+          </w:p>
+        </w:tc>
+      </w:tr>
+      <w:tr>
+        <w:tc>
+          <w:tcPr>
+            <w:tcW w:type="dxa" w:w="1200"/>
+            <w:tcBorders>
+              <w:top w:val="single" w:color="AAAAAA" w:sz="1"/>
+              <w:left w:val="single" w:color="AAAAAA" w:sz="1"/>
+              <w:bottom w:val="single" w:color="AAAAAA" w:sz="1"/>
+              <w:right w:val="single" w:color="AAAAAA" w:sz="1"/>
+            </w:tcBorders>
+            <w:tcMar>
+              <w:top w:type="dxa" w:w="60"/>
+              <w:left w:type="dxa" w:w="100"/>
+              <w:bottom w:type="dxa" w:w="60"/>
+              <w:right w:type="dxa" w:w="100"/>
+            </w:tcMar>
+          </w:tcPr>
+          <w:p>
+            <w:r>
+              <w:rPr>
+                <w:rFonts w:ascii="Arial" w:cs="Arial" w:eastAsia="Arial" w:hAnsi="Arial"/>
+                <w:b/>
+                <w:bCs/>
+                <w:sz w:val="20"/>
+                <w:szCs w:val="20"/>
+              </w:rPr>
+              <w:t xml:space="preserve">MN-INACTIVE</w:t>
+            </w:r>
+          </w:p>
+        </w:tc>
+        <w:tc>
+          <w:tcPr>
+            <w:tcW w:type="dxa" w:w="2400"/>
+            <w:tcBorders>
+              <w:top w:val="single" w:color="AAAAAA" w:sz="1"/>
+              <w:left w:val="single" w:color="AAAAAA" w:sz="1"/>
+              <w:bottom w:val="single" w:color="AAAAAA" w:sz="1"/>
+              <w:right w:val="single" w:color="AAAAAA" w:sz="1"/>
+            </w:tcBorders>
+            <w:tcMar>
+              <w:top w:type="dxa" w:w="60"/>
+              <w:left w:type="dxa" w:w="100"/>
+              <w:bottom w:type="dxa" w:w="60"/>
+              <w:right w:type="dxa" w:w="100"/>
+            </w:tcMar>
+          </w:tcPr>
+          <w:p>
+            <w:r>
+              <w:rPr>
+                <w:rFonts w:ascii="Arial" w:cs="Arial" w:eastAsia="Arial" w:hAnsi="Arial"/>
+                <w:sz w:val="20"/>
+                <w:szCs w:val="20"/>
+              </w:rPr>
+              <w:t xml:space="preserve">Activity Monitoring</w:t>
             </w:r>
           </w:p>
         </w:tc>
@@ -7669,24 +7782,6 @@
           <w:sz w:val="22"/>
           <w:szCs w:val="22"/>
         </w:rPr>
-        <w:t xml:space="preserve">Inactivity detection and administrator follow-up workflow</w:t>
-      </w:r>
-    </w:p>
-    <w:p>
-      <w:pPr>
-        <w:pStyle w:val="ListParagraph"/>
-        <w:numPr>
-          <w:ilvl w:val="0"/>
-          <w:numId w:val="2"/>
-        </w:numPr>
-        <w:spacing w:after="40"/>
-      </w:pPr>
-      <w:r>
-        <w:rPr>
-          <w:rFonts w:ascii="Arial" w:cs="Arial" w:eastAsia="Arial" w:hAnsi="Arial"/>
-          <w:sz w:val="22"/>
-          <w:szCs w:val="22"/>
-        </w:rPr>
         <w:t xml:space="preserve">Goal tracking and progress monitoring</w:t>
       </w:r>
     </w:p>
@@ -7724,6 +7819,274 @@
           <w:szCs w:val="22"/>
         </w:rPr>
         <w:t xml:space="preserve">Subject matter expert requests within engagements</w:t>
+      </w:r>
+    </w:p>
+    <w:p>
+      <w:pPr>
+        <w:spacing w:after="0"/>
+      </w:pPr>
+    </w:p>
+    <w:p>
+      <w:pPr>
+        <w:spacing w:after="120"/>
+      </w:pPr>
+      <w:r>
+        <w:rPr>
+          <w:rFonts w:ascii="Arial" w:cs="Arial" w:eastAsia="Arial" w:hAnsi="Arial"/>
+          <w:b/>
+          <w:bCs/>
+          <w:sz w:val="22"/>
+          <w:szCs w:val="22"/>
+        </w:rPr>
+        <w:t xml:space="preserve">MN-INACTIVE — Activity Monitoring  </w:t>
+      </w:r>
+    </w:p>
+    <w:tbl>
+      <w:tblPr>
+        <w:tblW w:type="dxa" w:w="1400"/>
+        <w:tblBorders>
+          <w:top w:val="single" w:color="auto" w:sz="4"/>
+          <w:left w:val="single" w:color="auto" w:sz="4"/>
+          <w:bottom w:val="single" w:color="auto" w:sz="4"/>
+          <w:right w:val="single" w:color="auto" w:sz="4"/>
+          <w:insideH w:val="single" w:color="auto" w:sz="4"/>
+          <w:insideV w:val="single" w:color="auto" w:sz="4"/>
+        </w:tblBorders>
+      </w:tblPr>
+      <w:tblGrid>
+        <w:gridCol w:w="1400"/>
+      </w:tblGrid>
+      <w:tr>
+        <w:tc>
+          <w:tcPr>
+            <w:tcW w:type="dxa" w:w="1400"/>
+            <w:tcBorders>
+              <w:top w:val="single" w:color="AAAAAA" w:sz="1"/>
+              <w:left w:val="single" w:color="AAAAAA" w:sz="1"/>
+              <w:bottom w:val="single" w:color="AAAAAA" w:sz="1"/>
+              <w:right w:val="single" w:color="AAAAAA" w:sz="1"/>
+            </w:tcBorders>
+            <w:shd w:fill="C6EFCE" w:val="clear"/>
+            <w:tcMar>
+              <w:top w:type="dxa" w:w="40"/>
+              <w:left w:type="dxa" w:w="80"/>
+              <w:bottom w:type="dxa" w:w="40"/>
+              <w:right w:type="dxa" w:w="80"/>
+            </w:tcMar>
+          </w:tcPr>
+          <w:p>
+            <w:pPr>
+              <w:jc w:val="center"/>
+            </w:pPr>
+            <w:r>
+              <w:rPr>
+                <w:rFonts w:ascii="Arial" w:cs="Arial" w:eastAsia="Arial" w:hAnsi="Arial"/>
+                <w:b/>
+                <w:bCs/>
+                <w:sz w:val="18"/>
+                <w:szCs w:val="18"/>
+              </w:rPr>
+              <w:t xml:space="preserve">Core</w:t>
+            </w:r>
+          </w:p>
+        </w:tc>
+      </w:tr>
+    </w:tbl>
+    <w:p>
+      <w:pPr>
+        <w:spacing w:after="0"/>
+      </w:pPr>
+    </w:p>
+    <w:p>
+      <w:pPr>
+        <w:spacing w:after="120"/>
+      </w:pPr>
+      <w:r>
+        <w:rPr>
+          <w:rFonts w:ascii="Arial" w:cs="Arial" w:eastAsia="Arial" w:hAnsi="Arial"/>
+          <w:sz w:val="22"/>
+          <w:szCs w:val="22"/>
+        </w:rPr>
+        <w:t xml:space="preserve">The continuous monitoring of active engagement activity levels to detect relationships that have gone quiet, alerting administrators before engagements are lost.</w:t>
+      </w:r>
+    </w:p>
+    <w:p>
+      <w:pPr>
+        <w:spacing w:after="40"/>
+      </w:pPr>
+      <w:r>
+        <w:rPr>
+          <w:rFonts w:ascii="Arial" w:cs="Arial" w:eastAsia="Arial" w:hAnsi="Arial"/>
+          <w:b/>
+          <w:bCs/>
+          <w:sz w:val="22"/>
+          <w:szCs w:val="22"/>
+        </w:rPr>
+        <w:t xml:space="preserve">Business Value:</w:t>
+      </w:r>
+    </w:p>
+    <w:p>
+      <w:pPr>
+        <w:pStyle w:val="ListParagraph"/>
+        <w:numPr>
+          <w:ilvl w:val="0"/>
+          <w:numId w:val="2"/>
+        </w:numPr>
+        <w:spacing w:after="40"/>
+      </w:pPr>
+      <w:r>
+        <w:rPr>
+          <w:rFonts w:ascii="Arial" w:cs="Arial" w:eastAsia="Arial" w:hAnsi="Arial"/>
+          <w:sz w:val="22"/>
+          <w:szCs w:val="22"/>
+        </w:rPr>
+        <w:t xml:space="preserve">Detects engagements where the mentoring relationship has gone quiet before the relationship is lost entirely</w:t>
+      </w:r>
+    </w:p>
+    <w:p>
+      <w:pPr>
+        <w:pStyle w:val="ListParagraph"/>
+        <w:numPr>
+          <w:ilvl w:val="0"/>
+          <w:numId w:val="2"/>
+        </w:numPr>
+        <w:spacing w:after="40"/>
+      </w:pPr>
+      <w:r>
+        <w:rPr>
+          <w:rFonts w:ascii="Arial" w:cs="Arial" w:eastAsia="Arial" w:hAnsi="Arial"/>
+          <w:sz w:val="22"/>
+          <w:szCs w:val="22"/>
+        </w:rPr>
+        <w:t xml:space="preserve">Provides cadence-aware monitoring that adapts thresholds to each engagement’s expected meeting frequency, reducing false positives</w:t>
+      </w:r>
+    </w:p>
+    <w:p>
+      <w:pPr>
+        <w:spacing w:after="0"/>
+      </w:pPr>
+    </w:p>
+    <w:p>
+      <w:pPr>
+        <w:spacing w:after="40"/>
+      </w:pPr>
+      <w:r>
+        <w:rPr>
+          <w:rFonts w:ascii="Arial" w:cs="Arial" w:eastAsia="Arial" w:hAnsi="Arial"/>
+          <w:b/>
+          <w:bCs/>
+          <w:sz w:val="22"/>
+          <w:szCs w:val="22"/>
+        </w:rPr>
+        <w:t xml:space="preserve">Key Capabilities:</w:t>
+      </w:r>
+    </w:p>
+    <w:p>
+      <w:pPr>
+        <w:pStyle w:val="ListParagraph"/>
+        <w:numPr>
+          <w:ilvl w:val="0"/>
+          <w:numId w:val="2"/>
+        </w:numPr>
+        <w:spacing w:after="40"/>
+      </w:pPr>
+      <w:r>
+        <w:rPr>
+          <w:rFonts w:ascii="Arial" w:cs="Arial" w:eastAsia="Arial" w:hAnsi="Arial"/>
+          <w:sz w:val="22"/>
+          <w:szCs w:val="22"/>
+        </w:rPr>
+        <w:t xml:space="preserve">Cadence-aware inactivity thresholds based on configured meeting frequency</w:t>
+      </w:r>
+    </w:p>
+    <w:p>
+      <w:pPr>
+        <w:pStyle w:val="ListParagraph"/>
+        <w:numPr>
+          <w:ilvl w:val="0"/>
+          <w:numId w:val="2"/>
+        </w:numPr>
+        <w:spacing w:after="40"/>
+      </w:pPr>
+      <w:r>
+        <w:rPr>
+          <w:rFonts w:ascii="Arial" w:cs="Arial" w:eastAsia="Arial" w:hAnsi="Arial"/>
+          <w:sz w:val="22"/>
+          <w:szCs w:val="22"/>
+        </w:rPr>
+        <w:t xml:space="preserve">Automatic engagement status progression through Dormant, Inactive, and Abandoned stages</w:t>
+      </w:r>
+    </w:p>
+    <w:p>
+      <w:pPr>
+        <w:pStyle w:val="ListParagraph"/>
+        <w:numPr>
+          <w:ilvl w:val="0"/>
+          <w:numId w:val="2"/>
+        </w:numPr>
+        <w:spacing w:after="40"/>
+      </w:pPr>
+      <w:r>
+        <w:rPr>
+          <w:rFonts w:ascii="Arial" w:cs="Arial" w:eastAsia="Arial" w:hAnsi="Arial"/>
+          <w:sz w:val="22"/>
+          <w:szCs w:val="22"/>
+        </w:rPr>
+        <w:t xml:space="preserve">Administrator alerting at each status transition</w:t>
+      </w:r>
+    </w:p>
+    <w:p>
+      <w:pPr>
+        <w:pStyle w:val="ListParagraph"/>
+        <w:numPr>
+          <w:ilvl w:val="0"/>
+          <w:numId w:val="2"/>
+        </w:numPr>
+        <w:spacing w:after="40"/>
+      </w:pPr>
+      <w:r>
+        <w:rPr>
+          <w:rFonts w:ascii="Arial" w:cs="Arial" w:eastAsia="Arial" w:hAnsi="Arial"/>
+          <w:sz w:val="22"/>
+          <w:szCs w:val="22"/>
+        </w:rPr>
+        <w:t xml:space="preserve">Automatic status reversion when qualifying activity resumes</w:t>
+      </w:r>
+    </w:p>
+    <w:p>
+      <w:pPr>
+        <w:pStyle w:val="ListParagraph"/>
+        <w:numPr>
+          <w:ilvl w:val="0"/>
+          <w:numId w:val="2"/>
+        </w:numPr>
+        <w:spacing w:after="40"/>
+      </w:pPr>
+      <w:r>
+        <w:rPr>
+          <w:rFonts w:ascii="Arial" w:cs="Arial" w:eastAsia="Arial" w:hAnsi="Arial"/>
+          <w:sz w:val="22"/>
+          <w:szCs w:val="22"/>
+        </w:rPr>
+        <w:t xml:space="preserve">Configurable monitoring thresholds</w:t>
+      </w:r>
+    </w:p>
+    <w:p>
+      <w:pPr>
+        <w:pStyle w:val="ListParagraph"/>
+        <w:numPr>
+          <w:ilvl w:val="0"/>
+          <w:numId w:val="2"/>
+        </w:numPr>
+        <w:spacing w:after="40"/>
+      </w:pPr>
+      <w:r>
+        <w:rPr>
+          <w:rFonts w:ascii="Arial" w:cs="Arial" w:eastAsia="Arial" w:hAnsi="Arial"/>
+          <w:sz w:val="22"/>
+          <w:szCs w:val="22"/>
+        </w:rPr>
+        <w:t xml:space="preserve">Exclusion of On Hold engagements from monitoring</w:t>
       </w:r>
     </w:p>
     <w:p>

</xml_diff>

<commit_message>
Add Cross-Domain Services section (Section 4) to Master PRD v2.1
- Added Section 4: Cross-Domain Services with four services:
  4.1 Notes Service (all domains, owns Note entity)
  4.2 Email Service (all domains, no owned entities)
  4.3 Calendar Service (all domains, no owned entities)
  4.4 Survey Service (MN, CR, owns Survey and Survey Response entities)
- Renumbered System Scope from Section 4 to Section 5
- Updated In Scope: broadened survey item, added calendar integration
- Added Calendar System to Key Integrations (Section 5.3)
- Version 2.0 -> 2.1, Last Updated 04-03-26 21:30
</commit_message>
<xml_diff>
--- a/PRDs/CBM-Master-PRD.docx
+++ b/PRDs/CBM-Master-PRD.docx
@@ -138,7 +138,7 @@
                 <w:sz w:val="20"/>
                 <w:szCs w:val="20"/>
               </w:rPr>
-              <w:t xml:space="preserve">2.0</w:t>
+              <w:t xml:space="preserve">2.1</w:t>
             </w:r>
           </w:p>
         </w:tc>
@@ -256,7 +256,7 @@
                 <w:sz w:val="20"/>
                 <w:szCs w:val="20"/>
               </w:rPr>
-              <w:t xml:space="preserve">03-30-26 21:00</w:t>
+              <w:t xml:space="preserve">04-03-26 21:30</w:t>
             </w:r>
           </w:p>
         </w:tc>
@@ -12470,7 +12470,20 @@
         <w:pStyle w:val="Heading1"/>
       </w:pPr>
       <w:r>
-        <w:t xml:space="preserve">4. System Scope</w:t>
+        <w:t xml:space="preserve">4. Cross-Domain Services</w:t>
+      </w:r>
+    </w:p>
+    <w:p>
+      <w:pPr>
+        <w:spacing w:after="120"/>
+      </w:pPr>
+      <w:r>
+        <w:rPr>
+          <w:rFonts w:ascii="Arial" w:cs="Arial" w:eastAsia="Arial" w:hAnsi="Arial"/>
+          <w:sz w:val="22"/>
+          <w:szCs w:val="22"/>
+        </w:rPr>
+        <w:t xml:space="preserve">Cross-Domain Services are shared platform capabilities that are not owned by any single domain but are consumed by multiple domains. Services are structurally parallel to domains: they can own entities, define processes, and produce their own reconciled Service PRD. Their purpose is to provide shared capabilities rather than to fulfill a standalone business function. Domain process documents reference services generically without needing to know their internal mechanics.</w:t>
       </w:r>
     </w:p>
     <w:p>
@@ -12478,474 +12491,8 @@
         <w:pStyle w:val="Heading2"/>
       </w:pPr>
       <w:r>
-        <w:t xml:space="preserve">4.1 In Scope</w:t>
-      </w:r>
-    </w:p>
-    <w:p>
-      <w:pPr>
-        <w:pStyle w:val="ListParagraph"/>
-        <w:numPr>
-          <w:ilvl w:val="0"/>
-          <w:numId w:val="2"/>
-        </w:numPr>
-        <w:spacing w:after="40"/>
-      </w:pPr>
-      <w:r>
-        <w:rPr>
-          <w:rFonts w:ascii="Arial" w:cs="Arial" w:eastAsia="Arial" w:hAnsi="Arial"/>
-          <w:sz w:val="22"/>
-          <w:szCs w:val="22"/>
-        </w:rPr>
-        <w:t xml:space="preserve">Client organization and contact record management throughout the full client lifecycle</w:t>
-      </w:r>
-    </w:p>
-    <w:p>
-      <w:pPr>
-        <w:pStyle w:val="ListParagraph"/>
-        <w:numPr>
-          <w:ilvl w:val="0"/>
-          <w:numId w:val="2"/>
-        </w:numPr>
-        <w:spacing w:after="40"/>
-      </w:pPr>
-      <w:r>
-        <w:rPr>
-          <w:rFonts w:ascii="Arial" w:cs="Arial" w:eastAsia="Arial" w:hAnsi="Arial"/>
-          <w:sz w:val="22"/>
-          <w:szCs w:val="22"/>
-        </w:rPr>
-        <w:t xml:space="preserve">Mentor contact record management throughout the full mentor lifecycle</w:t>
-      </w:r>
-    </w:p>
-    <w:p>
-      <w:pPr>
-        <w:pStyle w:val="ListParagraph"/>
-        <w:numPr>
-          <w:ilvl w:val="0"/>
-          <w:numId w:val="2"/>
-        </w:numPr>
-        <w:spacing w:after="40"/>
-      </w:pPr>
-      <w:r>
-        <w:rPr>
-          <w:rFonts w:ascii="Arial" w:cs="Arial" w:eastAsia="Arial" w:hAnsi="Arial"/>
-          <w:sz w:val="22"/>
-          <w:szCs w:val="22"/>
-        </w:rPr>
-        <w:t xml:space="preserve">Mentor-client engagement management from assignment through closure</w:t>
-      </w:r>
-    </w:p>
-    <w:p>
-      <w:pPr>
-        <w:pStyle w:val="ListParagraph"/>
-        <w:numPr>
-          <w:ilvl w:val="0"/>
-          <w:numId w:val="2"/>
-        </w:numPr>
-        <w:spacing w:after="40"/>
-      </w:pPr>
-      <w:r>
-        <w:rPr>
-          <w:rFonts w:ascii="Arial" w:cs="Arial" w:eastAsia="Arial" w:hAnsi="Arial"/>
-          <w:sz w:val="22"/>
-          <w:szCs w:val="22"/>
-        </w:rPr>
-        <w:t xml:space="preserve">Session tracking within engagements</w:t>
-      </w:r>
-    </w:p>
-    <w:p>
-      <w:pPr>
-        <w:pStyle w:val="ListParagraph"/>
-        <w:numPr>
-          <w:ilvl w:val="0"/>
-          <w:numId w:val="2"/>
-        </w:numPr>
-        <w:spacing w:after="40"/>
-      </w:pPr>
-      <w:r>
-        <w:rPr>
-          <w:rFonts w:ascii="Arial" w:cs="Arial" w:eastAsia="Arial" w:hAnsi="Arial"/>
-          <w:sz w:val="22"/>
-          <w:szCs w:val="22"/>
-        </w:rPr>
-        <w:t xml:space="preserve">Client satisfaction survey tracking</w:t>
-      </w:r>
-    </w:p>
-    <w:p>
-      <w:pPr>
-        <w:pStyle w:val="ListParagraph"/>
-        <w:numPr>
-          <w:ilvl w:val="0"/>
-          <w:numId w:val="2"/>
-        </w:numPr>
-        <w:spacing w:after="40"/>
-      </w:pPr>
-      <w:r>
-        <w:rPr>
-          <w:rFonts w:ascii="Arial" w:cs="Arial" w:eastAsia="Arial" w:hAnsi="Arial"/>
-          <w:sz w:val="22"/>
-          <w:szCs w:val="22"/>
-        </w:rPr>
-        <w:t xml:space="preserve">Mentor matching and assignment workflow</w:t>
-      </w:r>
-    </w:p>
-    <w:p>
-      <w:pPr>
-        <w:pStyle w:val="ListParagraph"/>
-        <w:numPr>
-          <w:ilvl w:val="0"/>
-          <w:numId w:val="2"/>
-        </w:numPr>
-        <w:spacing w:after="40"/>
-      </w:pPr>
-      <w:r>
-        <w:rPr>
-          <w:rFonts w:ascii="Arial" w:cs="Arial" w:eastAsia="Arial" w:hAnsi="Arial"/>
-          <w:sz w:val="22"/>
-          <w:szCs w:val="22"/>
-        </w:rPr>
-        <w:t xml:space="preserve">Inactivity monitoring and administrator follow-up workflow</w:t>
-      </w:r>
-    </w:p>
-    <w:p>
-      <w:pPr>
-        <w:pStyle w:val="ListParagraph"/>
-        <w:numPr>
-          <w:ilvl w:val="0"/>
-          <w:numId w:val="2"/>
-        </w:numPr>
-        <w:spacing w:after="40"/>
-      </w:pPr>
-      <w:r>
-        <w:rPr>
-          <w:rFonts w:ascii="Arial" w:cs="Arial" w:eastAsia="Arial" w:hAnsi="Arial"/>
-          <w:sz w:val="22"/>
-          <w:szCs w:val="22"/>
-        </w:rPr>
-        <w:t xml:space="preserve">Partner organization and contact record management</w:t>
-      </w:r>
-    </w:p>
-    <w:p>
-      <w:pPr>
-        <w:pStyle w:val="ListParagraph"/>
-        <w:numPr>
-          <w:ilvl w:val="0"/>
-          <w:numId w:val="2"/>
-        </w:numPr>
-        <w:spacing w:after="40"/>
-      </w:pPr>
-      <w:r>
-        <w:rPr>
-          <w:rFonts w:ascii="Arial" w:cs="Arial" w:eastAsia="Arial" w:hAnsi="Arial"/>
-          <w:sz w:val="22"/>
-          <w:szCs w:val="22"/>
-        </w:rPr>
-        <w:t xml:space="preserve">Partnership agreement tracking</w:t>
-      </w:r>
-    </w:p>
-    <w:p>
-      <w:pPr>
-        <w:pStyle w:val="ListParagraph"/>
-        <w:numPr>
-          <w:ilvl w:val="0"/>
-          <w:numId w:val="2"/>
-        </w:numPr>
-        <w:spacing w:after="40"/>
-      </w:pPr>
-      <w:r>
-        <w:rPr>
-          <w:rFonts w:ascii="Arial" w:cs="Arial" w:eastAsia="Arial" w:hAnsi="Arial"/>
-          <w:sz w:val="22"/>
-          <w:szCs w:val="22"/>
-        </w:rPr>
-        <w:t xml:space="preserve">Workshop and event management including registration and attendance</w:t>
-      </w:r>
-    </w:p>
-    <w:p>
-      <w:pPr>
-        <w:pStyle w:val="ListParagraph"/>
-        <w:numPr>
-          <w:ilvl w:val="0"/>
-          <w:numId w:val="2"/>
-        </w:numPr>
-        <w:spacing w:after="40"/>
-      </w:pPr>
-      <w:r>
-        <w:rPr>
-          <w:rFonts w:ascii="Arial" w:cs="Arial" w:eastAsia="Arial" w:hAnsi="Arial"/>
-          <w:sz w:val="22"/>
-          <w:szCs w:val="22"/>
-        </w:rPr>
-        <w:t xml:space="preserve">Prospect contact management for client and mentor recruitment outreach</w:t>
-      </w:r>
-    </w:p>
-    <w:p>
-      <w:pPr>
-        <w:pStyle w:val="ListParagraph"/>
-        <w:numPr>
-          <w:ilvl w:val="0"/>
-          <w:numId w:val="2"/>
-        </w:numPr>
-        <w:spacing w:after="40"/>
-      </w:pPr>
-      <w:r>
-        <w:rPr>
-          <w:rFonts w:ascii="Arial" w:cs="Arial" w:eastAsia="Arial" w:hAnsi="Arial"/>
-          <w:sz w:val="22"/>
-          <w:szCs w:val="22"/>
-        </w:rPr>
-        <w:t xml:space="preserve">Donor, sponsor, and grant record management</w:t>
-      </w:r>
-    </w:p>
-    <w:p>
-      <w:pPr>
-        <w:pStyle w:val="ListParagraph"/>
-        <w:numPr>
-          <w:ilvl w:val="0"/>
-          <w:numId w:val="2"/>
-        </w:numPr>
-        <w:spacing w:after="40"/>
-      </w:pPr>
-      <w:r>
-        <w:rPr>
-          <w:rFonts w:ascii="Arial" w:cs="Arial" w:eastAsia="Arial" w:hAnsi="Arial"/>
-          <w:sz w:val="22"/>
-          <w:szCs w:val="22"/>
-        </w:rPr>
-        <w:t xml:space="preserve">Fundraising campaign tracking</w:t>
-      </w:r>
-    </w:p>
-    <w:p>
-      <w:pPr>
-        <w:pStyle w:val="ListParagraph"/>
-        <w:numPr>
-          <w:ilvl w:val="0"/>
-          <w:numId w:val="2"/>
-        </w:numPr>
-        <w:spacing w:after="40"/>
-      </w:pPr>
-      <w:r>
-        <w:rPr>
-          <w:rFonts w:ascii="Arial" w:cs="Arial" w:eastAsia="Arial" w:hAnsi="Arial"/>
-          <w:sz w:val="22"/>
-          <w:szCs w:val="22"/>
-        </w:rPr>
-        <w:t xml:space="preserve">Organizational reporting and analytics across all four domains</w:t>
-      </w:r>
-    </w:p>
-    <w:p>
-      <w:pPr>
-        <w:pStyle w:val="ListParagraph"/>
-        <w:numPr>
-          <w:ilvl w:val="0"/>
-          <w:numId w:val="2"/>
-        </w:numPr>
-        <w:spacing w:after="40"/>
-      </w:pPr>
-      <w:r>
-        <w:rPr>
-          <w:rFonts w:ascii="Arial" w:cs="Arial" w:eastAsia="Arial" w:hAnsi="Arial"/>
-          <w:sz w:val="22"/>
-          <w:szCs w:val="22"/>
-        </w:rPr>
-        <w:t xml:space="preserve">Role-based access control ensuring each persona sees only the data appropriate to their role</w:t>
-      </w:r>
-    </w:p>
-    <w:p>
-      <w:pPr>
-        <w:pStyle w:val="ListParagraph"/>
-        <w:numPr>
-          <w:ilvl w:val="0"/>
-          <w:numId w:val="2"/>
-        </w:numPr>
-        <w:spacing w:after="40"/>
-      </w:pPr>
-      <w:r>
-        <w:rPr>
-          <w:rFonts w:ascii="Arial" w:cs="Arial" w:eastAsia="Arial" w:hAnsi="Arial"/>
-          <w:sz w:val="22"/>
-          <w:szCs w:val="22"/>
-        </w:rPr>
-        <w:t xml:space="preserve">Integration with the public website for client and mentor application intake</w:t>
-      </w:r>
-    </w:p>
-    <w:p>
-      <w:pPr>
-        <w:pStyle w:val="ListParagraph"/>
-        <w:numPr>
-          <w:ilvl w:val="0"/>
-          <w:numId w:val="2"/>
-        </w:numPr>
-        <w:spacing w:after="40"/>
-      </w:pPr>
-      <w:r>
-        <w:rPr>
-          <w:rFonts w:ascii="Arial" w:cs="Arial" w:eastAsia="Arial" w:hAnsi="Arial"/>
-          <w:sz w:val="22"/>
-          <w:szCs w:val="22"/>
-        </w:rPr>
-        <w:t xml:space="preserve">Integration with the organizational email system for all CRM communications</w:t>
-      </w:r>
-    </w:p>
-    <w:p>
-      <w:pPr>
-        <w:pStyle w:val="ListParagraph"/>
-        <w:numPr>
-          <w:ilvl w:val="0"/>
-          <w:numId w:val="2"/>
-        </w:numPr>
-        <w:spacing w:after="40"/>
-      </w:pPr>
-      <w:r>
-        <w:rPr>
-          <w:rFonts w:ascii="Arial" w:cs="Arial" w:eastAsia="Arial" w:hAnsi="Arial"/>
-          <w:sz w:val="22"/>
-          <w:szCs w:val="22"/>
-        </w:rPr>
-        <w:t xml:space="preserve">Integration with the learning management system for mentor training tracking</w:t>
-      </w:r>
-    </w:p>
-    <w:p>
-      <w:pPr>
-        <w:pStyle w:val="Heading2"/>
-      </w:pPr>
-      <w:r>
-        <w:t xml:space="preserve">4.2 Out of Scope</w:t>
-      </w:r>
-    </w:p>
-    <w:p>
-      <w:pPr>
-        <w:pStyle w:val="ListParagraph"/>
-        <w:numPr>
-          <w:ilvl w:val="0"/>
-          <w:numId w:val="2"/>
-        </w:numPr>
-        <w:spacing w:after="40"/>
-      </w:pPr>
-      <w:r>
-        <w:rPr>
-          <w:rFonts w:ascii="Arial" w:cs="Arial" w:eastAsia="Arial" w:hAnsi="Arial"/>
-          <w:sz w:val="22"/>
-          <w:szCs w:val="22"/>
-        </w:rPr>
-        <w:t xml:space="preserve">Delivery of online learning content — managed by the learning management system</w:t>
-      </w:r>
-    </w:p>
-    <w:p>
-      <w:pPr>
-        <w:pStyle w:val="ListParagraph"/>
-        <w:numPr>
-          <w:ilvl w:val="0"/>
-          <w:numId w:val="2"/>
-        </w:numPr>
-        <w:spacing w:after="40"/>
-      </w:pPr>
-      <w:r>
-        <w:rPr>
-          <w:rFonts w:ascii="Arial" w:cs="Arial" w:eastAsia="Arial" w:hAnsi="Arial"/>
-          <w:sz w:val="22"/>
-          <w:szCs w:val="22"/>
-        </w:rPr>
-        <w:t xml:space="preserve">Email marketing campaign creation and delivery — managed by an external campaign platform; the CRM maintains contact lists as the source of truth</w:t>
-      </w:r>
-    </w:p>
-    <w:p>
-      <w:pPr>
-        <w:pStyle w:val="ListParagraph"/>
-        <w:numPr>
-          <w:ilvl w:val="0"/>
-          <w:numId w:val="2"/>
-        </w:numPr>
-        <w:spacing w:after="40"/>
-      </w:pPr>
-      <w:r>
-        <w:rPr>
-          <w:rFonts w:ascii="Arial" w:cs="Arial" w:eastAsia="Arial" w:hAnsi="Arial"/>
-          <w:sz w:val="22"/>
-          <w:szCs w:val="22"/>
-        </w:rPr>
-        <w:t xml:space="preserve">Website content management — managed by the website platform</w:t>
-      </w:r>
-    </w:p>
-    <w:p>
-      <w:pPr>
-        <w:pStyle w:val="ListParagraph"/>
-        <w:numPr>
-          <w:ilvl w:val="0"/>
-          <w:numId w:val="2"/>
-        </w:numPr>
-        <w:spacing w:after="40"/>
-      </w:pPr>
-      <w:r>
-        <w:rPr>
-          <w:rFonts w:ascii="Arial" w:cs="Arial" w:eastAsia="Arial" w:hAnsi="Arial"/>
-          <w:sz w:val="22"/>
-          <w:szCs w:val="22"/>
-        </w:rPr>
-        <w:t xml:space="preserve">Financial accounting and bookkeeping — the CRM tracks contributions but is not an accounting system</w:t>
-      </w:r>
-    </w:p>
-    <w:p>
-      <w:pPr>
-        <w:pStyle w:val="ListParagraph"/>
-        <w:numPr>
-          <w:ilvl w:val="0"/>
-          <w:numId w:val="2"/>
-        </w:numPr>
-        <w:spacing w:after="40"/>
-      </w:pPr>
-      <w:r>
-        <w:rPr>
-          <w:rFonts w:ascii="Arial" w:cs="Arial" w:eastAsia="Arial" w:hAnsi="Arial"/>
-          <w:sz w:val="22"/>
-          <w:szCs w:val="22"/>
-        </w:rPr>
-        <w:t xml:space="preserve">Document storage beyond attachments directly relevant to CRM records</w:t>
-      </w:r>
-    </w:p>
-    <w:p>
-      <w:pPr>
-        <w:pStyle w:val="ListParagraph"/>
-        <w:numPr>
-          <w:ilvl w:val="0"/>
-          <w:numId w:val="2"/>
-        </w:numPr>
-        <w:spacing w:after="40"/>
-      </w:pPr>
-      <w:r>
-        <w:rPr>
-          <w:rFonts w:ascii="Arial" w:cs="Arial" w:eastAsia="Arial" w:hAnsi="Arial"/>
-          <w:sz w:val="22"/>
-          <w:szCs w:val="22"/>
-        </w:rPr>
-        <w:t xml:space="preserve">Video conferencing and session delivery — mentors and clients use their preferred tools</w:t>
-      </w:r>
-    </w:p>
-    <w:p>
-      <w:pPr>
-        <w:pStyle w:val="Heading2"/>
-      </w:pPr>
-      <w:r>
-        <w:t xml:space="preserve">4.3 Key Integrations</w:t>
-      </w:r>
-    </w:p>
-    <w:p>
-      <w:pPr>
-        <w:spacing w:after="120"/>
-      </w:pPr>
-      <w:r>
-        <w:rPr>
-          <w:rFonts w:ascii="Arial" w:cs="Arial" w:eastAsia="Arial" w:hAnsi="Arial"/>
-          <w:sz w:val="22"/>
-          <w:szCs w:val="22"/>
-        </w:rPr>
-        <w:t xml:space="preserve">The CRM connects to the following external systems. Integration details are defined in implementation documentation — this section describes the business purpose of each integration only.</w:t>
-      </w:r>
-    </w:p>
-    <w:p>
-      <w:pPr>
-        <w:spacing w:after="0"/>
-      </w:pPr>
+        <w:t xml:space="preserve">4.1 Notes Service</w:t>
+      </w:r>
     </w:p>
     <w:p>
       <w:pPr>
@@ -12959,21 +12506,21 @@
           <w:sz w:val="22"/>
           <w:szCs w:val="22"/>
         </w:rPr>
-        <w:t xml:space="preserve">Website — </w:t>
-      </w:r>
-      <w:r>
-        <w:rPr>
-          <w:rFonts w:ascii="Arial" w:cs="Arial" w:eastAsia="Arial" w:hAnsi="Arial"/>
-          <w:sz w:val="22"/>
-          <w:szCs w:val="22"/>
-        </w:rPr>
-        <w:t xml:space="preserve">The public website submits client mentoring requests and mentor applications directly into the CRM, automatically creating the appropriate records.</w:t>
-      </w:r>
-    </w:p>
-    <w:p>
-      <w:pPr>
-        <w:spacing w:after="0"/>
-      </w:pPr>
+        <w:t xml:space="preserve">Purpose</w:t>
+      </w:r>
+    </w:p>
+    <w:p>
+      <w:pPr>
+        <w:spacing w:after="120"/>
+      </w:pPr>
+      <w:r>
+        <w:rPr>
+          <w:rFonts w:ascii="Arial" w:cs="Arial" w:eastAsia="Arial" w:hAnsi="Arial"/>
+          <w:sz w:val="22"/>
+          <w:szCs w:val="22"/>
+        </w:rPr>
+        <w:t xml:space="preserve">Provides the ability to attach free-form, timestamped notes to any CRM record. Notes support administrative documentation, relationship context, and operational observations across all domains. This service covers general-purpose notes only — structured session notes and engagement notes within the Mentoring domain remain domain-specific.</w:t>
+      </w:r>
     </w:p>
     <w:p>
       <w:pPr>
@@ -12987,6 +12534,1107 @@
           <w:sz w:val="22"/>
           <w:szCs w:val="22"/>
         </w:rPr>
+        <w:t xml:space="preserve">Capabilities</w:t>
+      </w:r>
+    </w:p>
+    <w:p>
+      <w:pPr>
+        <w:pStyle w:val="ListParagraph"/>
+        <w:numPr>
+          <w:ilvl w:val="0"/>
+          <w:numId w:val="2"/>
+        </w:numPr>
+        <w:spacing w:after="40"/>
+      </w:pPr>
+      <w:r>
+        <w:rPr>
+          <w:rFonts w:ascii="Arial" w:cs="Arial" w:eastAsia="Arial" w:hAnsi="Arial"/>
+          <w:sz w:val="22"/>
+          <w:szCs w:val="22"/>
+        </w:rPr>
+        <w:t xml:space="preserve">Create, view, and manage free-form notes on any CRM record (contacts, organizations, engagements, partners, donors, events)</w:t>
+      </w:r>
+    </w:p>
+    <w:p>
+      <w:pPr>
+        <w:pStyle w:val="ListParagraph"/>
+        <w:numPr>
+          <w:ilvl w:val="0"/>
+          <w:numId w:val="2"/>
+        </w:numPr>
+        <w:spacing w:after="40"/>
+      </w:pPr>
+      <w:r>
+        <w:rPr>
+          <w:rFonts w:ascii="Arial" w:cs="Arial" w:eastAsia="Arial" w:hAnsi="Arial"/>
+          <w:sz w:val="22"/>
+          <w:szCs w:val="22"/>
+        </w:rPr>
+        <w:t xml:space="preserve">Each note is attributed to the authoring user with an automatic timestamp</w:t>
+      </w:r>
+    </w:p>
+    <w:p>
+      <w:pPr>
+        <w:pStyle w:val="ListParagraph"/>
+        <w:numPr>
+          <w:ilvl w:val="0"/>
+          <w:numId w:val="2"/>
+        </w:numPr>
+        <w:spacing w:after="40"/>
+      </w:pPr>
+      <w:r>
+        <w:rPr>
+          <w:rFonts w:ascii="Arial" w:cs="Arial" w:eastAsia="Arial" w:hAnsi="Arial"/>
+          <w:sz w:val="22"/>
+          <w:szCs w:val="22"/>
+        </w:rPr>
+        <w:t xml:space="preserve">Notes are visible to any user with access to the parent record</w:t>
+      </w:r>
+    </w:p>
+    <w:p>
+      <w:pPr>
+        <w:spacing w:after="120"/>
+      </w:pPr>
+      <w:r>
+        <w:rPr>
+          <w:rFonts w:ascii="Arial" w:cs="Arial" w:eastAsia="Arial" w:hAnsi="Arial"/>
+          <w:b/>
+          <w:bCs/>
+          <w:sz w:val="22"/>
+          <w:szCs w:val="22"/>
+        </w:rPr>
+        <w:t xml:space="preserve">Consuming Domains:</w:t>
+      </w:r>
+      <w:r>
+        <w:rPr>
+          <w:rFonts w:ascii="Arial" w:cs="Arial" w:eastAsia="Arial" w:hAnsi="Arial"/>
+          <w:sz w:val="22"/>
+          <w:szCs w:val="22"/>
+        </w:rPr>
+        <w:t xml:space="preserve"> Mentoring (MN), Mentor Recruitment (MR), Client Recruiting (CR), Fundraising (FU)</w:t>
+      </w:r>
+    </w:p>
+    <w:p>
+      <w:pPr>
+        <w:spacing w:after="120"/>
+      </w:pPr>
+      <w:r>
+        <w:rPr>
+          <w:rFonts w:ascii="Arial" w:cs="Arial" w:eastAsia="Arial" w:hAnsi="Arial"/>
+          <w:b/>
+          <w:bCs/>
+          <w:sz w:val="22"/>
+          <w:szCs w:val="22"/>
+        </w:rPr>
+        <w:t xml:space="preserve">Entities Owned:</w:t>
+      </w:r>
+      <w:r>
+        <w:rPr>
+          <w:rFonts w:ascii="Arial" w:cs="Arial" w:eastAsia="Arial" w:hAnsi="Arial"/>
+          <w:sz w:val="22"/>
+          <w:szCs w:val="22"/>
+        </w:rPr>
+        <w:t xml:space="preserve"> Note</w:t>
+      </w:r>
+    </w:p>
+    <w:p>
+      <w:pPr>
+        <w:pStyle w:val="Heading2"/>
+      </w:pPr>
+      <w:r>
+        <w:t xml:space="preserve">4.2 Email Service</w:t>
+      </w:r>
+    </w:p>
+    <w:p>
+      <w:pPr>
+        <w:spacing w:after="120"/>
+      </w:pPr>
+      <w:r>
+        <w:rPr>
+          <w:rFonts w:ascii="Arial" w:cs="Arial" w:eastAsia="Arial" w:hAnsi="Arial"/>
+          <w:b/>
+          <w:bCs/>
+          <w:sz w:val="22"/>
+          <w:szCs w:val="22"/>
+        </w:rPr>
+        <w:t xml:space="preserve">Purpose</w:t>
+      </w:r>
+    </w:p>
+    <w:p>
+      <w:pPr>
+        <w:spacing w:after="120"/>
+      </w:pPr>
+      <w:r>
+        <w:rPr>
+          <w:rFonts w:ascii="Arial" w:cs="Arial" w:eastAsia="Arial" w:hAnsi="Arial"/>
+          <w:sz w:val="22"/>
+          <w:szCs w:val="22"/>
+        </w:rPr>
+        <w:t xml:space="preserve">Provides shared email communication capability integrated with the organizational email system. The Email Service enables all CRM users to send and receive email within the CRM and automatically logs all communications against the relevant contact and record, maintaining a complete communication history.</w:t>
+      </w:r>
+    </w:p>
+    <w:p>
+      <w:pPr>
+        <w:spacing w:after="120"/>
+      </w:pPr>
+      <w:r>
+        <w:rPr>
+          <w:rFonts w:ascii="Arial" w:cs="Arial" w:eastAsia="Arial" w:hAnsi="Arial"/>
+          <w:b/>
+          <w:bCs/>
+          <w:sz w:val="22"/>
+          <w:szCs w:val="22"/>
+        </w:rPr>
+        <w:t xml:space="preserve">Capabilities</w:t>
+      </w:r>
+    </w:p>
+    <w:p>
+      <w:pPr>
+        <w:pStyle w:val="ListParagraph"/>
+        <w:numPr>
+          <w:ilvl w:val="0"/>
+          <w:numId w:val="2"/>
+        </w:numPr>
+        <w:spacing w:after="40"/>
+      </w:pPr>
+      <w:r>
+        <w:rPr>
+          <w:rFonts w:ascii="Arial" w:cs="Arial" w:eastAsia="Arial" w:hAnsi="Arial"/>
+          <w:sz w:val="22"/>
+          <w:szCs w:val="22"/>
+        </w:rPr>
+        <w:t xml:space="preserve">Send and receive email within the CRM through the organizational email system</w:t>
+      </w:r>
+    </w:p>
+    <w:p>
+      <w:pPr>
+        <w:pStyle w:val="ListParagraph"/>
+        <w:numPr>
+          <w:ilvl w:val="0"/>
+          <w:numId w:val="2"/>
+        </w:numPr>
+        <w:spacing w:after="40"/>
+      </w:pPr>
+      <w:r>
+        <w:rPr>
+          <w:rFonts w:ascii="Arial" w:cs="Arial" w:eastAsia="Arial" w:hAnsi="Arial"/>
+          <w:sz w:val="22"/>
+          <w:szCs w:val="22"/>
+        </w:rPr>
+        <w:t xml:space="preserve">Automatically log all sent and received email against the relevant contact and record</w:t>
+      </w:r>
+    </w:p>
+    <w:p>
+      <w:pPr>
+        <w:pStyle w:val="ListParagraph"/>
+        <w:numPr>
+          <w:ilvl w:val="0"/>
+          <w:numId w:val="2"/>
+        </w:numPr>
+        <w:spacing w:after="40"/>
+      </w:pPr>
+      <w:r>
+        <w:rPr>
+          <w:rFonts w:ascii="Arial" w:cs="Arial" w:eastAsia="Arial" w:hAnsi="Arial"/>
+          <w:sz w:val="22"/>
+          <w:szCs w:val="22"/>
+        </w:rPr>
+        <w:t xml:space="preserve">Maintain a complete communication history accessible from any contact, engagement, partner, or donor record</w:t>
+      </w:r>
+    </w:p>
+    <w:p>
+      <w:pPr>
+        <w:spacing w:after="120"/>
+      </w:pPr>
+      <w:r>
+        <w:rPr>
+          <w:rFonts w:ascii="Arial" w:cs="Arial" w:eastAsia="Arial" w:hAnsi="Arial"/>
+          <w:b/>
+          <w:bCs/>
+          <w:sz w:val="22"/>
+          <w:szCs w:val="22"/>
+        </w:rPr>
+        <w:t xml:space="preserve">Consuming Domains:</w:t>
+      </w:r>
+      <w:r>
+        <w:rPr>
+          <w:rFonts w:ascii="Arial" w:cs="Arial" w:eastAsia="Arial" w:hAnsi="Arial"/>
+          <w:sz w:val="22"/>
+          <w:szCs w:val="22"/>
+        </w:rPr>
+        <w:t xml:space="preserve"> Mentoring (MN), Mentor Recruitment (MR), Client Recruiting (CR), Fundraising (FU)</w:t>
+      </w:r>
+    </w:p>
+    <w:p>
+      <w:pPr>
+        <w:spacing w:after="120"/>
+      </w:pPr>
+      <w:r>
+        <w:rPr>
+          <w:rFonts w:ascii="Arial" w:cs="Arial" w:eastAsia="Arial" w:hAnsi="Arial"/>
+          <w:b/>
+          <w:bCs/>
+          <w:sz w:val="22"/>
+          <w:szCs w:val="22"/>
+        </w:rPr>
+        <w:t xml:space="preserve">Entities Owned:</w:t>
+      </w:r>
+      <w:r>
+        <w:rPr>
+          <w:rFonts w:ascii="Arial" w:cs="Arial" w:eastAsia="Arial" w:hAnsi="Arial"/>
+          <w:sz w:val="22"/>
+          <w:szCs w:val="22"/>
+        </w:rPr>
+        <w:t xml:space="preserve"> None — email records are managed natively by the CRM platform</w:t>
+      </w:r>
+    </w:p>
+    <w:p>
+      <w:pPr>
+        <w:pStyle w:val="Heading2"/>
+      </w:pPr>
+      <w:r>
+        <w:t xml:space="preserve">4.3 Calendar Service</w:t>
+      </w:r>
+    </w:p>
+    <w:p>
+      <w:pPr>
+        <w:spacing w:after="120"/>
+      </w:pPr>
+      <w:r>
+        <w:rPr>
+          <w:rFonts w:ascii="Arial" w:cs="Arial" w:eastAsia="Arial" w:hAnsi="Arial"/>
+          <w:b/>
+          <w:bCs/>
+          <w:sz w:val="22"/>
+          <w:szCs w:val="22"/>
+        </w:rPr>
+        <w:t xml:space="preserve">Purpose</w:t>
+      </w:r>
+    </w:p>
+    <w:p>
+      <w:pPr>
+        <w:spacing w:after="120"/>
+      </w:pPr>
+      <w:r>
+        <w:rPr>
+          <w:rFonts w:ascii="Arial" w:cs="Arial" w:eastAsia="Arial" w:hAnsi="Arial"/>
+          <w:sz w:val="22"/>
+          <w:szCs w:val="22"/>
+        </w:rPr>
+        <w:t xml:space="preserve">Provides calendar availability visibility and ad-hoc appointment creation, integrated with the organizational calendar system. The Calendar Service enables users to see their full availability when scheduling follow-up sessions or meetings and to create standalone appointments outside of any domain workflow.</w:t>
+      </w:r>
+    </w:p>
+    <w:p>
+      <w:pPr>
+        <w:spacing w:after="120"/>
+      </w:pPr>
+      <w:r>
+        <w:rPr>
+          <w:rFonts w:ascii="Arial" w:cs="Arial" w:eastAsia="Arial" w:hAnsi="Arial"/>
+          <w:b/>
+          <w:bCs/>
+          <w:sz w:val="22"/>
+          <w:szCs w:val="22"/>
+        </w:rPr>
+        <w:t xml:space="preserve">Capabilities</w:t>
+      </w:r>
+    </w:p>
+    <w:p>
+      <w:pPr>
+        <w:pStyle w:val="ListParagraph"/>
+        <w:numPr>
+          <w:ilvl w:val="0"/>
+          <w:numId w:val="2"/>
+        </w:numPr>
+        <w:spacing w:after="40"/>
+      </w:pPr>
+      <w:r>
+        <w:rPr>
+          <w:rFonts w:ascii="Arial" w:cs="Arial" w:eastAsia="Arial" w:hAnsi="Arial"/>
+          <w:sz w:val="22"/>
+          <w:szCs w:val="22"/>
+        </w:rPr>
+        <w:t xml:space="preserve">Display availability across all calendars linked to the user’s organizational calendar account, including personal calendars the user has configured in their account</w:t>
+      </w:r>
+    </w:p>
+    <w:p>
+      <w:pPr>
+        <w:pStyle w:val="ListParagraph"/>
+        <w:numPr>
+          <w:ilvl w:val="0"/>
+          <w:numId w:val="2"/>
+        </w:numPr>
+        <w:spacing w:after="40"/>
+      </w:pPr>
+      <w:r>
+        <w:rPr>
+          <w:rFonts w:ascii="Arial" w:cs="Arial" w:eastAsia="Arial" w:hAnsi="Arial"/>
+          <w:sz w:val="22"/>
+          <w:szCs w:val="22"/>
+        </w:rPr>
+        <w:t xml:space="preserve">Create ad-hoc appointments on the user’s organizational calendar outside of any domain workflow</w:t>
+      </w:r>
+    </w:p>
+    <w:p>
+      <w:pPr>
+        <w:spacing w:after="120"/>
+      </w:pPr>
+      <w:r>
+        <w:rPr>
+          <w:rFonts w:ascii="Arial" w:cs="Arial" w:eastAsia="Arial" w:hAnsi="Arial"/>
+          <w:b/>
+          <w:bCs/>
+          <w:sz w:val="22"/>
+          <w:szCs w:val="22"/>
+        </w:rPr>
+        <w:t xml:space="preserve">Consuming Domains:</w:t>
+      </w:r>
+      <w:r>
+        <w:rPr>
+          <w:rFonts w:ascii="Arial" w:cs="Arial" w:eastAsia="Arial" w:hAnsi="Arial"/>
+          <w:sz w:val="22"/>
+          <w:szCs w:val="22"/>
+        </w:rPr>
+        <w:t xml:space="preserve"> Mentoring (MN), Mentor Recruitment (MR), Client Recruiting (CR), Fundraising (FU)</w:t>
+      </w:r>
+    </w:p>
+    <w:p>
+      <w:pPr>
+        <w:spacing w:after="120"/>
+      </w:pPr>
+      <w:r>
+        <w:rPr>
+          <w:rFonts w:ascii="Arial" w:cs="Arial" w:eastAsia="Arial" w:hAnsi="Arial"/>
+          <w:b/>
+          <w:bCs/>
+          <w:sz w:val="22"/>
+          <w:szCs w:val="22"/>
+        </w:rPr>
+        <w:t xml:space="preserve">Entities Owned:</w:t>
+      </w:r>
+      <w:r>
+        <w:rPr>
+          <w:rFonts w:ascii="Arial" w:cs="Arial" w:eastAsia="Arial" w:hAnsi="Arial"/>
+          <w:sz w:val="22"/>
+          <w:szCs w:val="22"/>
+        </w:rPr>
+        <w:t xml:space="preserve"> None — appointments are managed by the external calendar system</w:t>
+      </w:r>
+    </w:p>
+    <w:p>
+      <w:pPr>
+        <w:pStyle w:val="Heading2"/>
+      </w:pPr>
+      <w:r>
+        <w:t xml:space="preserve">4.4 Survey Service</w:t>
+      </w:r>
+    </w:p>
+    <w:p>
+      <w:pPr>
+        <w:spacing w:after="120"/>
+      </w:pPr>
+      <w:r>
+        <w:rPr>
+          <w:rFonts w:ascii="Arial" w:cs="Arial" w:eastAsia="Arial" w:hAnsi="Arial"/>
+          <w:b/>
+          <w:bCs/>
+          <w:sz w:val="22"/>
+          <w:szCs w:val="22"/>
+        </w:rPr>
+        <w:t xml:space="preserve">Purpose</w:t>
+      </w:r>
+    </w:p>
+    <w:p>
+      <w:pPr>
+        <w:spacing w:after="120"/>
+      </w:pPr>
+      <w:r>
+        <w:rPr>
+          <w:rFonts w:ascii="Arial" w:cs="Arial" w:eastAsia="Arial" w:hAnsi="Arial"/>
+          <w:sz w:val="22"/>
+          <w:szCs w:val="22"/>
+        </w:rPr>
+        <w:t xml:space="preserve">Provides shared survey creation, delivery, and response collection capability for gathering feedback across program areas. The Survey Service provides the mechanics of survey management — creation, delivery, response collection, and result recording. Domain processes define when and why surveys are sent; the Survey Service provides the how.</w:t>
+      </w:r>
+    </w:p>
+    <w:p>
+      <w:pPr>
+        <w:spacing w:after="120"/>
+      </w:pPr>
+      <w:r>
+        <w:rPr>
+          <w:rFonts w:ascii="Arial" w:cs="Arial" w:eastAsia="Arial" w:hAnsi="Arial"/>
+          <w:b/>
+          <w:bCs/>
+          <w:sz w:val="22"/>
+          <w:szCs w:val="22"/>
+        </w:rPr>
+        <w:t xml:space="preserve">Capabilities</w:t>
+      </w:r>
+    </w:p>
+    <w:p>
+      <w:pPr>
+        <w:pStyle w:val="ListParagraph"/>
+        <w:numPr>
+          <w:ilvl w:val="0"/>
+          <w:numId w:val="2"/>
+        </w:numPr>
+        <w:spacing w:after="40"/>
+      </w:pPr>
+      <w:r>
+        <w:rPr>
+          <w:rFonts w:ascii="Arial" w:cs="Arial" w:eastAsia="Arial" w:hAnsi="Arial"/>
+          <w:sz w:val="22"/>
+          <w:szCs w:val="22"/>
+        </w:rPr>
+        <w:t xml:space="preserve">Create and configure surveys with custom questions and response types</w:t>
+      </w:r>
+    </w:p>
+    <w:p>
+      <w:pPr>
+        <w:pStyle w:val="ListParagraph"/>
+        <w:numPr>
+          <w:ilvl w:val="0"/>
+          <w:numId w:val="2"/>
+        </w:numPr>
+        <w:spacing w:after="40"/>
+      </w:pPr>
+      <w:r>
+        <w:rPr>
+          <w:rFonts w:ascii="Arial" w:cs="Arial" w:eastAsia="Arial" w:hAnsi="Arial"/>
+          <w:sz w:val="22"/>
+          <w:szCs w:val="22"/>
+        </w:rPr>
+        <w:t xml:space="preserve">Deliver surveys to recipients at defined intervals or trigger points</w:t>
+      </w:r>
+    </w:p>
+    <w:p>
+      <w:pPr>
+        <w:pStyle w:val="ListParagraph"/>
+        <w:numPr>
+          <w:ilvl w:val="0"/>
+          <w:numId w:val="2"/>
+        </w:numPr>
+        <w:spacing w:after="40"/>
+      </w:pPr>
+      <w:r>
+        <w:rPr>
+          <w:rFonts w:ascii="Arial" w:cs="Arial" w:eastAsia="Arial" w:hAnsi="Arial"/>
+          <w:sz w:val="22"/>
+          <w:szCs w:val="22"/>
+        </w:rPr>
+        <w:t xml:space="preserve">Collect and record responses linked to the relevant CRM records (contacts, engagements, partners, events)</w:t>
+      </w:r>
+    </w:p>
+    <w:p>
+      <w:pPr>
+        <w:pStyle w:val="ListParagraph"/>
+        <w:numPr>
+          <w:ilvl w:val="0"/>
+          <w:numId w:val="2"/>
+        </w:numPr>
+        <w:spacing w:after="40"/>
+      </w:pPr>
+      <w:r>
+        <w:rPr>
+          <w:rFonts w:ascii="Arial" w:cs="Arial" w:eastAsia="Arial" w:hAnsi="Arial"/>
+          <w:sz w:val="22"/>
+          <w:szCs w:val="22"/>
+        </w:rPr>
+        <w:t xml:space="preserve">Make response data available for reporting and trend analysis</w:t>
+      </w:r>
+    </w:p>
+    <w:p>
+      <w:pPr>
+        <w:spacing w:after="120"/>
+      </w:pPr>
+      <w:r>
+        <w:rPr>
+          <w:rFonts w:ascii="Arial" w:cs="Arial" w:eastAsia="Arial" w:hAnsi="Arial"/>
+          <w:b/>
+          <w:bCs/>
+          <w:sz w:val="22"/>
+          <w:szCs w:val="22"/>
+        </w:rPr>
+        <w:t xml:space="preserve">Consuming Domains:</w:t>
+      </w:r>
+      <w:r>
+        <w:rPr>
+          <w:rFonts w:ascii="Arial" w:cs="Arial" w:eastAsia="Arial" w:hAnsi="Arial"/>
+          <w:sz w:val="22"/>
+          <w:szCs w:val="22"/>
+        </w:rPr>
+        <w:t xml:space="preserve"> Mentoring (MN), Client Recruiting (CR)</w:t>
+      </w:r>
+    </w:p>
+    <w:p>
+      <w:pPr>
+        <w:spacing w:after="120"/>
+      </w:pPr>
+      <w:r>
+        <w:rPr>
+          <w:rFonts w:ascii="Arial" w:cs="Arial" w:eastAsia="Arial" w:hAnsi="Arial"/>
+          <w:b/>
+          <w:bCs/>
+          <w:sz w:val="22"/>
+          <w:szCs w:val="22"/>
+        </w:rPr>
+        <w:t xml:space="preserve">Entities Owned:</w:t>
+      </w:r>
+      <w:r>
+        <w:rPr>
+          <w:rFonts w:ascii="Arial" w:cs="Arial" w:eastAsia="Arial" w:hAnsi="Arial"/>
+          <w:sz w:val="22"/>
+          <w:szCs w:val="22"/>
+        </w:rPr>
+        <w:t xml:space="preserve"> Survey, Survey Response</w:t>
+      </w:r>
+    </w:p>
+    <w:p>
+      <w:r>
+        <w:br w:type="page"/>
+      </w:r>
+    </w:p>
+    <w:p>
+      <w:pPr>
+        <w:pStyle w:val="Heading1"/>
+      </w:pPr>
+      <w:r>
+        <w:t xml:space="preserve">5. System Scope</w:t>
+      </w:r>
+    </w:p>
+    <w:p>
+      <w:pPr>
+        <w:pStyle w:val="Heading2"/>
+      </w:pPr>
+      <w:r>
+        <w:t xml:space="preserve">5.1 In Scope</w:t>
+      </w:r>
+    </w:p>
+    <w:p>
+      <w:pPr>
+        <w:pStyle w:val="ListParagraph"/>
+        <w:numPr>
+          <w:ilvl w:val="0"/>
+          <w:numId w:val="2"/>
+        </w:numPr>
+        <w:spacing w:after="40"/>
+      </w:pPr>
+      <w:r>
+        <w:rPr>
+          <w:rFonts w:ascii="Arial" w:cs="Arial" w:eastAsia="Arial" w:hAnsi="Arial"/>
+          <w:sz w:val="22"/>
+          <w:szCs w:val="22"/>
+        </w:rPr>
+        <w:t xml:space="preserve">Client organization and contact record management throughout the full client lifecycle</w:t>
+      </w:r>
+    </w:p>
+    <w:p>
+      <w:pPr>
+        <w:pStyle w:val="ListParagraph"/>
+        <w:numPr>
+          <w:ilvl w:val="0"/>
+          <w:numId w:val="2"/>
+        </w:numPr>
+        <w:spacing w:after="40"/>
+      </w:pPr>
+      <w:r>
+        <w:rPr>
+          <w:rFonts w:ascii="Arial" w:cs="Arial" w:eastAsia="Arial" w:hAnsi="Arial"/>
+          <w:sz w:val="22"/>
+          <w:szCs w:val="22"/>
+        </w:rPr>
+        <w:t xml:space="preserve">Mentor contact record management throughout the full mentor lifecycle</w:t>
+      </w:r>
+    </w:p>
+    <w:p>
+      <w:pPr>
+        <w:pStyle w:val="ListParagraph"/>
+        <w:numPr>
+          <w:ilvl w:val="0"/>
+          <w:numId w:val="2"/>
+        </w:numPr>
+        <w:spacing w:after="40"/>
+      </w:pPr>
+      <w:r>
+        <w:rPr>
+          <w:rFonts w:ascii="Arial" w:cs="Arial" w:eastAsia="Arial" w:hAnsi="Arial"/>
+          <w:sz w:val="22"/>
+          <w:szCs w:val="22"/>
+        </w:rPr>
+        <w:t xml:space="preserve">Mentor-client engagement management from assignment through closure</w:t>
+      </w:r>
+    </w:p>
+    <w:p>
+      <w:pPr>
+        <w:pStyle w:val="ListParagraph"/>
+        <w:numPr>
+          <w:ilvl w:val="0"/>
+          <w:numId w:val="2"/>
+        </w:numPr>
+        <w:spacing w:after="40"/>
+      </w:pPr>
+      <w:r>
+        <w:rPr>
+          <w:rFonts w:ascii="Arial" w:cs="Arial" w:eastAsia="Arial" w:hAnsi="Arial"/>
+          <w:sz w:val="22"/>
+          <w:szCs w:val="22"/>
+        </w:rPr>
+        <w:t xml:space="preserve">Session tracking within engagements</w:t>
+      </w:r>
+    </w:p>
+    <w:p>
+      <w:pPr>
+        <w:pStyle w:val="ListParagraph"/>
+        <w:numPr>
+          <w:ilvl w:val="0"/>
+          <w:numId w:val="2"/>
+        </w:numPr>
+        <w:spacing w:after="40"/>
+      </w:pPr>
+      <w:r>
+        <w:rPr>
+          <w:rFonts w:ascii="Arial" w:cs="Arial" w:eastAsia="Arial" w:hAnsi="Arial"/>
+          <w:sz w:val="22"/>
+          <w:szCs w:val="22"/>
+        </w:rPr>
+        <w:t xml:space="preserve">Survey delivery and response tracking across program areas</w:t>
+      </w:r>
+    </w:p>
+    <w:p>
+      <w:pPr>
+        <w:pStyle w:val="ListParagraph"/>
+        <w:numPr>
+          <w:ilvl w:val="0"/>
+          <w:numId w:val="2"/>
+        </w:numPr>
+        <w:spacing w:after="40"/>
+      </w:pPr>
+      <w:r>
+        <w:rPr>
+          <w:rFonts w:ascii="Arial" w:cs="Arial" w:eastAsia="Arial" w:hAnsi="Arial"/>
+          <w:sz w:val="22"/>
+          <w:szCs w:val="22"/>
+        </w:rPr>
+        <w:t xml:space="preserve">Mentor matching and assignment workflow</w:t>
+      </w:r>
+    </w:p>
+    <w:p>
+      <w:pPr>
+        <w:pStyle w:val="ListParagraph"/>
+        <w:numPr>
+          <w:ilvl w:val="0"/>
+          <w:numId w:val="2"/>
+        </w:numPr>
+        <w:spacing w:after="40"/>
+      </w:pPr>
+      <w:r>
+        <w:rPr>
+          <w:rFonts w:ascii="Arial" w:cs="Arial" w:eastAsia="Arial" w:hAnsi="Arial"/>
+          <w:sz w:val="22"/>
+          <w:szCs w:val="22"/>
+        </w:rPr>
+        <w:t xml:space="preserve">Inactivity monitoring and administrator follow-up workflow</w:t>
+      </w:r>
+    </w:p>
+    <w:p>
+      <w:pPr>
+        <w:pStyle w:val="ListParagraph"/>
+        <w:numPr>
+          <w:ilvl w:val="0"/>
+          <w:numId w:val="2"/>
+        </w:numPr>
+        <w:spacing w:after="40"/>
+      </w:pPr>
+      <w:r>
+        <w:rPr>
+          <w:rFonts w:ascii="Arial" w:cs="Arial" w:eastAsia="Arial" w:hAnsi="Arial"/>
+          <w:sz w:val="22"/>
+          <w:szCs w:val="22"/>
+        </w:rPr>
+        <w:t xml:space="preserve">Partner organization and contact record management</w:t>
+      </w:r>
+    </w:p>
+    <w:p>
+      <w:pPr>
+        <w:pStyle w:val="ListParagraph"/>
+        <w:numPr>
+          <w:ilvl w:val="0"/>
+          <w:numId w:val="2"/>
+        </w:numPr>
+        <w:spacing w:after="40"/>
+      </w:pPr>
+      <w:r>
+        <w:rPr>
+          <w:rFonts w:ascii="Arial" w:cs="Arial" w:eastAsia="Arial" w:hAnsi="Arial"/>
+          <w:sz w:val="22"/>
+          <w:szCs w:val="22"/>
+        </w:rPr>
+        <w:t xml:space="preserve">Partnership agreement tracking</w:t>
+      </w:r>
+    </w:p>
+    <w:p>
+      <w:pPr>
+        <w:pStyle w:val="ListParagraph"/>
+        <w:numPr>
+          <w:ilvl w:val="0"/>
+          <w:numId w:val="2"/>
+        </w:numPr>
+        <w:spacing w:after="40"/>
+      </w:pPr>
+      <w:r>
+        <w:rPr>
+          <w:rFonts w:ascii="Arial" w:cs="Arial" w:eastAsia="Arial" w:hAnsi="Arial"/>
+          <w:sz w:val="22"/>
+          <w:szCs w:val="22"/>
+        </w:rPr>
+        <w:t xml:space="preserve">Workshop and event management including registration and attendance</w:t>
+      </w:r>
+    </w:p>
+    <w:p>
+      <w:pPr>
+        <w:pStyle w:val="ListParagraph"/>
+        <w:numPr>
+          <w:ilvl w:val="0"/>
+          <w:numId w:val="2"/>
+        </w:numPr>
+        <w:spacing w:after="40"/>
+      </w:pPr>
+      <w:r>
+        <w:rPr>
+          <w:rFonts w:ascii="Arial" w:cs="Arial" w:eastAsia="Arial" w:hAnsi="Arial"/>
+          <w:sz w:val="22"/>
+          <w:szCs w:val="22"/>
+        </w:rPr>
+        <w:t xml:space="preserve">Prospect contact management for client and mentor recruitment outreach</w:t>
+      </w:r>
+    </w:p>
+    <w:p>
+      <w:pPr>
+        <w:pStyle w:val="ListParagraph"/>
+        <w:numPr>
+          <w:ilvl w:val="0"/>
+          <w:numId w:val="2"/>
+        </w:numPr>
+        <w:spacing w:after="40"/>
+      </w:pPr>
+      <w:r>
+        <w:rPr>
+          <w:rFonts w:ascii="Arial" w:cs="Arial" w:eastAsia="Arial" w:hAnsi="Arial"/>
+          <w:sz w:val="22"/>
+          <w:szCs w:val="22"/>
+        </w:rPr>
+        <w:t xml:space="preserve">Donor, sponsor, and grant record management</w:t>
+      </w:r>
+    </w:p>
+    <w:p>
+      <w:pPr>
+        <w:pStyle w:val="ListParagraph"/>
+        <w:numPr>
+          <w:ilvl w:val="0"/>
+          <w:numId w:val="2"/>
+        </w:numPr>
+        <w:spacing w:after="40"/>
+      </w:pPr>
+      <w:r>
+        <w:rPr>
+          <w:rFonts w:ascii="Arial" w:cs="Arial" w:eastAsia="Arial" w:hAnsi="Arial"/>
+          <w:sz w:val="22"/>
+          <w:szCs w:val="22"/>
+        </w:rPr>
+        <w:t xml:space="preserve">Fundraising campaign tracking</w:t>
+      </w:r>
+    </w:p>
+    <w:p>
+      <w:pPr>
+        <w:pStyle w:val="ListParagraph"/>
+        <w:numPr>
+          <w:ilvl w:val="0"/>
+          <w:numId w:val="2"/>
+        </w:numPr>
+        <w:spacing w:after="40"/>
+      </w:pPr>
+      <w:r>
+        <w:rPr>
+          <w:rFonts w:ascii="Arial" w:cs="Arial" w:eastAsia="Arial" w:hAnsi="Arial"/>
+          <w:sz w:val="22"/>
+          <w:szCs w:val="22"/>
+        </w:rPr>
+        <w:t xml:space="preserve">Organizational reporting and analytics across all four domains</w:t>
+      </w:r>
+    </w:p>
+    <w:p>
+      <w:pPr>
+        <w:pStyle w:val="ListParagraph"/>
+        <w:numPr>
+          <w:ilvl w:val="0"/>
+          <w:numId w:val="2"/>
+        </w:numPr>
+        <w:spacing w:after="40"/>
+      </w:pPr>
+      <w:r>
+        <w:rPr>
+          <w:rFonts w:ascii="Arial" w:cs="Arial" w:eastAsia="Arial" w:hAnsi="Arial"/>
+          <w:sz w:val="22"/>
+          <w:szCs w:val="22"/>
+        </w:rPr>
+        <w:t xml:space="preserve">Role-based access control ensuring each persona sees only the data appropriate to their role</w:t>
+      </w:r>
+    </w:p>
+    <w:p>
+      <w:pPr>
+        <w:pStyle w:val="ListParagraph"/>
+        <w:numPr>
+          <w:ilvl w:val="0"/>
+          <w:numId w:val="2"/>
+        </w:numPr>
+        <w:spacing w:after="40"/>
+      </w:pPr>
+      <w:r>
+        <w:rPr>
+          <w:rFonts w:ascii="Arial" w:cs="Arial" w:eastAsia="Arial" w:hAnsi="Arial"/>
+          <w:sz w:val="22"/>
+          <w:szCs w:val="22"/>
+        </w:rPr>
+        <w:t xml:space="preserve">Integration with the public website for client and mentor application intake</w:t>
+      </w:r>
+    </w:p>
+    <w:p>
+      <w:pPr>
+        <w:pStyle w:val="ListParagraph"/>
+        <w:numPr>
+          <w:ilvl w:val="0"/>
+          <w:numId w:val="2"/>
+        </w:numPr>
+        <w:spacing w:after="40"/>
+      </w:pPr>
+      <w:r>
+        <w:rPr>
+          <w:rFonts w:ascii="Arial" w:cs="Arial" w:eastAsia="Arial" w:hAnsi="Arial"/>
+          <w:sz w:val="22"/>
+          <w:szCs w:val="22"/>
+        </w:rPr>
+        <w:t xml:space="preserve">Integration with the organizational email system for all CRM communications</w:t>
+      </w:r>
+    </w:p>
+    <w:p>
+      <w:pPr>
+        <w:pStyle w:val="ListParagraph"/>
+        <w:numPr>
+          <w:ilvl w:val="0"/>
+          <w:numId w:val="2"/>
+        </w:numPr>
+        <w:spacing w:after="40"/>
+      </w:pPr>
+      <w:r>
+        <w:rPr>
+          <w:rFonts w:ascii="Arial" w:cs="Arial" w:eastAsia="Arial" w:hAnsi="Arial"/>
+          <w:sz w:val="22"/>
+          <w:szCs w:val="22"/>
+        </w:rPr>
+        <w:t xml:space="preserve">Integration with the organizational calendar system for availability visibility and ad-hoc appointment creation</w:t>
+      </w:r>
+    </w:p>
+    <w:p>
+      <w:pPr>
+        <w:pStyle w:val="ListParagraph"/>
+        <w:numPr>
+          <w:ilvl w:val="0"/>
+          <w:numId w:val="2"/>
+        </w:numPr>
+        <w:spacing w:after="40"/>
+      </w:pPr>
+      <w:r>
+        <w:rPr>
+          <w:rFonts w:ascii="Arial" w:cs="Arial" w:eastAsia="Arial" w:hAnsi="Arial"/>
+          <w:sz w:val="22"/>
+          <w:szCs w:val="22"/>
+        </w:rPr>
+        <w:t xml:space="preserve">Integration with the learning management system for mentor training tracking</w:t>
+      </w:r>
+    </w:p>
+    <w:p>
+      <w:pPr>
+        <w:pStyle w:val="Heading2"/>
+      </w:pPr>
+      <w:r>
+        <w:t xml:space="preserve">5.2 Out of Scope</w:t>
+      </w:r>
+    </w:p>
+    <w:p>
+      <w:pPr>
+        <w:pStyle w:val="ListParagraph"/>
+        <w:numPr>
+          <w:ilvl w:val="0"/>
+          <w:numId w:val="2"/>
+        </w:numPr>
+        <w:spacing w:after="40"/>
+      </w:pPr>
+      <w:r>
+        <w:rPr>
+          <w:rFonts w:ascii="Arial" w:cs="Arial" w:eastAsia="Arial" w:hAnsi="Arial"/>
+          <w:sz w:val="22"/>
+          <w:szCs w:val="22"/>
+        </w:rPr>
+        <w:t xml:space="preserve">Delivery of online learning content — managed by the learning management system</w:t>
+      </w:r>
+    </w:p>
+    <w:p>
+      <w:pPr>
+        <w:pStyle w:val="ListParagraph"/>
+        <w:numPr>
+          <w:ilvl w:val="0"/>
+          <w:numId w:val="2"/>
+        </w:numPr>
+        <w:spacing w:after="40"/>
+      </w:pPr>
+      <w:r>
+        <w:rPr>
+          <w:rFonts w:ascii="Arial" w:cs="Arial" w:eastAsia="Arial" w:hAnsi="Arial"/>
+          <w:sz w:val="22"/>
+          <w:szCs w:val="22"/>
+        </w:rPr>
+        <w:t xml:space="preserve">Email marketing campaign creation and delivery — managed by an external campaign platform; the CRM maintains contact lists as the source of truth</w:t>
+      </w:r>
+    </w:p>
+    <w:p>
+      <w:pPr>
+        <w:pStyle w:val="ListParagraph"/>
+        <w:numPr>
+          <w:ilvl w:val="0"/>
+          <w:numId w:val="2"/>
+        </w:numPr>
+        <w:spacing w:after="40"/>
+      </w:pPr>
+      <w:r>
+        <w:rPr>
+          <w:rFonts w:ascii="Arial" w:cs="Arial" w:eastAsia="Arial" w:hAnsi="Arial"/>
+          <w:sz w:val="22"/>
+          <w:szCs w:val="22"/>
+        </w:rPr>
+        <w:t xml:space="preserve">Website content management — managed by the website platform</w:t>
+      </w:r>
+    </w:p>
+    <w:p>
+      <w:pPr>
+        <w:pStyle w:val="ListParagraph"/>
+        <w:numPr>
+          <w:ilvl w:val="0"/>
+          <w:numId w:val="2"/>
+        </w:numPr>
+        <w:spacing w:after="40"/>
+      </w:pPr>
+      <w:r>
+        <w:rPr>
+          <w:rFonts w:ascii="Arial" w:cs="Arial" w:eastAsia="Arial" w:hAnsi="Arial"/>
+          <w:sz w:val="22"/>
+          <w:szCs w:val="22"/>
+        </w:rPr>
+        <w:t xml:space="preserve">Financial accounting and bookkeeping — the CRM tracks contributions but is not an accounting system</w:t>
+      </w:r>
+    </w:p>
+    <w:p>
+      <w:pPr>
+        <w:pStyle w:val="ListParagraph"/>
+        <w:numPr>
+          <w:ilvl w:val="0"/>
+          <w:numId w:val="2"/>
+        </w:numPr>
+        <w:spacing w:after="40"/>
+      </w:pPr>
+      <w:r>
+        <w:rPr>
+          <w:rFonts w:ascii="Arial" w:cs="Arial" w:eastAsia="Arial" w:hAnsi="Arial"/>
+          <w:sz w:val="22"/>
+          <w:szCs w:val="22"/>
+        </w:rPr>
+        <w:t xml:space="preserve">Document storage beyond attachments directly relevant to CRM records</w:t>
+      </w:r>
+    </w:p>
+    <w:p>
+      <w:pPr>
+        <w:pStyle w:val="ListParagraph"/>
+        <w:numPr>
+          <w:ilvl w:val="0"/>
+          <w:numId w:val="2"/>
+        </w:numPr>
+        <w:spacing w:after="40"/>
+      </w:pPr>
+      <w:r>
+        <w:rPr>
+          <w:rFonts w:ascii="Arial" w:cs="Arial" w:eastAsia="Arial" w:hAnsi="Arial"/>
+          <w:sz w:val="22"/>
+          <w:szCs w:val="22"/>
+        </w:rPr>
+        <w:t xml:space="preserve">Video conferencing and session delivery — mentors and clients use their preferred tools</w:t>
+      </w:r>
+    </w:p>
+    <w:p>
+      <w:pPr>
+        <w:pStyle w:val="Heading2"/>
+      </w:pPr>
+      <w:r>
+        <w:t xml:space="preserve">5.3 Key Integrations</w:t>
+      </w:r>
+    </w:p>
+    <w:p>
+      <w:pPr>
+        <w:spacing w:after="120"/>
+      </w:pPr>
+      <w:r>
+        <w:rPr>
+          <w:rFonts w:ascii="Arial" w:cs="Arial" w:eastAsia="Arial" w:hAnsi="Arial"/>
+          <w:sz w:val="22"/>
+          <w:szCs w:val="22"/>
+        </w:rPr>
+        <w:t xml:space="preserve">The CRM connects to the following external systems. Integration details are defined in implementation documentation — this section describes the business purpose of each integration only.</w:t>
+      </w:r>
+    </w:p>
+    <w:p>
+      <w:pPr>
+        <w:spacing w:after="0"/>
+      </w:pPr>
+    </w:p>
+    <w:p>
+      <w:pPr>
+        <w:spacing w:after="120"/>
+      </w:pPr>
+      <w:r>
+        <w:rPr>
+          <w:rFonts w:ascii="Arial" w:cs="Arial" w:eastAsia="Arial" w:hAnsi="Arial"/>
+          <w:b/>
+          <w:bCs/>
+          <w:sz w:val="22"/>
+          <w:szCs w:val="22"/>
+        </w:rPr>
+        <w:t xml:space="preserve">Website — </w:t>
+      </w:r>
+      <w:r>
+        <w:rPr>
+          <w:rFonts w:ascii="Arial" w:cs="Arial" w:eastAsia="Arial" w:hAnsi="Arial"/>
+          <w:sz w:val="22"/>
+          <w:szCs w:val="22"/>
+        </w:rPr>
+        <w:t xml:space="preserve">The public website submits client mentoring requests and mentor applications directly into the CRM, automatically creating the appropriate records.</w:t>
+      </w:r>
+    </w:p>
+    <w:p>
+      <w:pPr>
+        <w:spacing w:after="0"/>
+      </w:pPr>
+    </w:p>
+    <w:p>
+      <w:pPr>
+        <w:spacing w:after="120"/>
+      </w:pPr>
+      <w:r>
+        <w:rPr>
+          <w:rFonts w:ascii="Arial" w:cs="Arial" w:eastAsia="Arial" w:hAnsi="Arial"/>
+          <w:b/>
+          <w:bCs/>
+          <w:sz w:val="22"/>
+          <w:szCs w:val="22"/>
+        </w:rPr>
         <w:t xml:space="preserve">Email System — </w:t>
       </w:r>
       <w:r>
@@ -12996,6 +13644,34 @@
           <w:szCs w:val="22"/>
         </w:rPr>
         <w:t xml:space="preserve">The CRM sends and receives email through the organizational email system, maintaining a complete communication history within each contact and engagement record.</w:t>
+      </w:r>
+    </w:p>
+    <w:p>
+      <w:pPr>
+        <w:spacing w:after="0"/>
+      </w:pPr>
+    </w:p>
+    <w:p>
+      <w:pPr>
+        <w:spacing w:after="120"/>
+      </w:pPr>
+      <w:r>
+        <w:rPr>
+          <w:rFonts w:ascii="Arial" w:cs="Arial" w:eastAsia="Arial" w:hAnsi="Arial"/>
+          <w:b/>
+          <w:bCs/>
+          <w:sz w:val="22"/>
+          <w:szCs w:val="22"/>
+        </w:rPr>
+        <w:t xml:space="preserve">Calendar System — </w:t>
+      </w:r>
+      <w:r>
+        <w:rPr>
+          <w:rFonts w:ascii="Arial" w:cs="Arial" w:eastAsia="Arial" w:hAnsi="Arial"/>
+          <w:sz w:val="22"/>
+          <w:szCs w:val="22"/>
+        </w:rPr>
+        <w:t xml:space="preserve">The CRM connects to the organizational calendar system to display user availability when scheduling sessions and meetings. Availability reflects all calendars linked to the user’s organizational calendar account, including personal calendars the user has configured. Users can also create ad-hoc appointments on their organizational calendar directly from the CRM.</w:t>
       </w:r>
     </w:p>
     <w:p>

</xml_diff>

<commit_message>
Master PRD v2.2: Restructure CR domain with sub-domains
- CR domain now organized into 4 sub-domains: CR-PARTNER, CR-MARKETING,
  CR-EVENTS, CR-REACTIVATE
- Domain Purpose updated to describe sub-domain structure and parent
  domain oversight role
- Business Processes section replaced with Sub-Domains section containing
  purpose, business value, and key capabilities for each sub-domain
- Process Tier Summary table updated with 4 sub-domain rows replacing
  3 process rows; column header changed to 'Process / Sub-Domain'
- CR-EVENTS expanded to explicitly include virtual events and webinars
- CR-REACTIVATE added as new sub-domain for alumni re-engagement and
  warm lead recovery
- Key Data Categories updated with reactivation and conversion records
- Individual process inventories deferred to Domain/Sub-Domain Overview
</commit_message>
<xml_diff>
--- a/PRDs/CBM-Master-PRD.docx
+++ b/PRDs/CBM-Master-PRD.docx
@@ -138,7 +138,7 @@
                 <w:sz w:val="20"/>
                 <w:szCs w:val="20"/>
               </w:rPr>
-              <w:t xml:space="preserve">2.1</w:t>
+              <w:t xml:space="preserve">2.2</w:t>
             </w:r>
           </w:p>
         </w:tc>
@@ -256,7 +256,7 @@
                 <w:sz w:val="20"/>
                 <w:szCs w:val="20"/>
               </w:rPr>
-              <w:t xml:space="preserve">04-03-26 21:30</w:t>
+              <w:t xml:space="preserve">04-04-26 20:30</w:t>
             </w:r>
           </w:p>
         </w:tc>
@@ -4942,7 +4942,7 @@
                 <w:sz w:val="20"/>
                 <w:szCs w:val="20"/>
               </w:rPr>
-              <w:t xml:space="preserve">Process</w:t>
+              <w:t xml:space="preserve">Process / Sub-Domain</w:t>
             </w:r>
           </w:p>
         </w:tc>
@@ -6278,7 +6278,7 @@
                 <w:sz w:val="20"/>
                 <w:szCs w:val="20"/>
               </w:rPr>
-              <w:t xml:space="preserve">CR-OUTREACH</w:t>
+              <w:t xml:space="preserve">CR-PARTNER</w:t>
             </w:r>
           </w:p>
         </w:tc>
@@ -6305,7 +6305,120 @@
                 <w:sz w:val="20"/>
                 <w:szCs w:val="20"/>
               </w:rPr>
-              <w:t xml:space="preserve">Client Outreach and Marketing</w:t>
+              <w:t xml:space="preserve">Partner Relationship Management (Sub-Domain)</w:t>
+            </w:r>
+          </w:p>
+        </w:tc>
+        <w:tc>
+          <w:tcPr>
+            <w:tcW w:type="dxa" w:w="3960"/>
+            <w:tcBorders>
+              <w:top w:val="single" w:color="AAAAAA" w:sz="1"/>
+              <w:left w:val="single" w:color="AAAAAA" w:sz="1"/>
+              <w:bottom w:val="single" w:color="AAAAAA" w:sz="1"/>
+              <w:right w:val="single" w:color="AAAAAA" w:sz="1"/>
+            </w:tcBorders>
+            <w:tcMar>
+              <w:top w:type="dxa" w:w="60"/>
+              <w:left w:type="dxa" w:w="100"/>
+              <w:bottom w:type="dxa" w:w="60"/>
+              <w:right w:type="dxa" w:w="100"/>
+            </w:tcMar>
+          </w:tcPr>
+          <w:p>
+            <w:r>
+              <w:rPr>
+                <w:rFonts w:ascii="Arial" w:cs="Arial" w:eastAsia="Arial" w:hAnsi="Arial"/>
+                <w:sz w:val="20"/>
+                <w:szCs w:val="20"/>
+              </w:rPr>
+              <w:t xml:space="preserve">Client Recruiting (CR)</w:t>
+            </w:r>
+          </w:p>
+        </w:tc>
+        <w:tc>
+          <w:tcPr>
+            <w:tcW w:type="dxa" w:w="1800"/>
+            <w:tcBorders>
+              <w:top w:val="single" w:color="AAAAAA" w:sz="1"/>
+              <w:left w:val="single" w:color="AAAAAA" w:sz="1"/>
+              <w:bottom w:val="single" w:color="AAAAAA" w:sz="1"/>
+              <w:right w:val="single" w:color="AAAAAA" w:sz="1"/>
+            </w:tcBorders>
+            <w:shd w:fill="C6EFCE" w:val="clear"/>
+            <w:tcMar>
+              <w:top w:type="dxa" w:w="60"/>
+              <w:left w:type="dxa" w:w="100"/>
+              <w:bottom w:type="dxa" w:w="60"/>
+              <w:right w:type="dxa" w:w="100"/>
+            </w:tcMar>
+          </w:tcPr>
+          <w:p>
+            <w:r>
+              <w:rPr>
+                <w:rFonts w:ascii="Arial" w:cs="Arial" w:eastAsia="Arial" w:hAnsi="Arial"/>
+                <w:sz w:val="20"/>
+                <w:szCs w:val="20"/>
+              </w:rPr>
+              <w:t xml:space="preserve">Core</w:t>
+            </w:r>
+          </w:p>
+        </w:tc>
+      </w:tr>
+      <w:tr>
+        <w:tc>
+          <w:tcPr>
+            <w:tcW w:type="dxa" w:w="1200"/>
+            <w:tcBorders>
+              <w:top w:val="single" w:color="AAAAAA" w:sz="1"/>
+              <w:left w:val="single" w:color="AAAAAA" w:sz="1"/>
+              <w:bottom w:val="single" w:color="AAAAAA" w:sz="1"/>
+              <w:right w:val="single" w:color="AAAAAA" w:sz="1"/>
+            </w:tcBorders>
+            <w:tcMar>
+              <w:top w:type="dxa" w:w="60"/>
+              <w:left w:type="dxa" w:w="100"/>
+              <w:bottom w:type="dxa" w:w="60"/>
+              <w:right w:type="dxa" w:w="100"/>
+            </w:tcMar>
+          </w:tcPr>
+          <w:p>
+            <w:r>
+              <w:rPr>
+                <w:rFonts w:ascii="Arial" w:cs="Arial" w:eastAsia="Arial" w:hAnsi="Arial"/>
+                <w:b/>
+                <w:bCs/>
+                <w:sz w:val="20"/>
+                <w:szCs w:val="20"/>
+              </w:rPr>
+              <w:t xml:space="preserve">CR-MARKETING</w:t>
+            </w:r>
+          </w:p>
+        </w:tc>
+        <w:tc>
+          <w:tcPr>
+            <w:tcW w:type="dxa" w:w="2400"/>
+            <w:tcBorders>
+              <w:top w:val="single" w:color="AAAAAA" w:sz="1"/>
+              <w:left w:val="single" w:color="AAAAAA" w:sz="1"/>
+              <w:bottom w:val="single" w:color="AAAAAA" w:sz="1"/>
+              <w:right w:val="single" w:color="AAAAAA" w:sz="1"/>
+            </w:tcBorders>
+            <w:tcMar>
+              <w:top w:type="dxa" w:w="60"/>
+              <w:left w:type="dxa" w:w="100"/>
+              <w:bottom w:type="dxa" w:w="60"/>
+              <w:right w:type="dxa" w:w="100"/>
+            </w:tcMar>
+          </w:tcPr>
+          <w:p>
+            <w:r>
+              <w:rPr>
+                <w:rFonts w:ascii="Arial" w:cs="Arial" w:eastAsia="Arial" w:hAnsi="Arial"/>
+                <w:sz w:val="20"/>
+                <w:szCs w:val="20"/>
+              </w:rPr>
+              <w:t xml:space="preserve">Outreach and Marketing (Sub-Domain)</w:t>
             </w:r>
           </w:p>
         </w:tc>
@@ -6391,7 +6504,7 @@
                 <w:sz w:val="20"/>
                 <w:szCs w:val="20"/>
               </w:rPr>
-              <w:t xml:space="preserve">CR-PARTNER</w:t>
+              <w:t xml:space="preserve">CR-EVENTS</w:t>
             </w:r>
           </w:p>
         </w:tc>
@@ -6418,7 +6531,7 @@
                 <w:sz w:val="20"/>
                 <w:szCs w:val="20"/>
               </w:rPr>
-              <w:t xml:space="preserve">Partner Relationship Management</w:t>
+              <w:t xml:space="preserve">Workshops and Event Management (Sub-Domain)</w:t>
             </w:r>
           </w:p>
         </w:tc>
@@ -6458,7 +6571,7 @@
               <w:bottom w:val="single" w:color="AAAAAA" w:sz="1"/>
               <w:right w:val="single" w:color="AAAAAA" w:sz="1"/>
             </w:tcBorders>
-            <w:shd w:fill="C6EFCE" w:val="clear"/>
+            <w:shd w:fill="BDD7EE" w:val="clear"/>
             <w:tcMar>
               <w:top w:type="dxa" w:w="60"/>
               <w:left w:type="dxa" w:w="100"/>
@@ -6473,7 +6586,7 @@
                 <w:sz w:val="20"/>
                 <w:szCs w:val="20"/>
               </w:rPr>
-              <w:t xml:space="preserve">Core</w:t>
+              <w:t xml:space="preserve">Important</w:t>
             </w:r>
           </w:p>
         </w:tc>
@@ -6504,7 +6617,7 @@
                 <w:sz w:val="20"/>
                 <w:szCs w:val="20"/>
               </w:rPr>
-              <w:t xml:space="preserve">CR-EVENTS</w:t>
+              <w:t xml:space="preserve">CR-REACTIVATE</w:t>
             </w:r>
           </w:p>
         </w:tc>
@@ -6531,7 +6644,7 @@
                 <w:sz w:val="20"/>
                 <w:szCs w:val="20"/>
               </w:rPr>
-              <w:t xml:space="preserve">Workshop and Event Management</w:t>
+              <w:t xml:space="preserve">Client Reactivation and Recovery (Sub-Domain)</w:t>
             </w:r>
           </w:p>
         </w:tc>
@@ -10229,7 +10342,7 @@
           <w:sz w:val="22"/>
           <w:szCs w:val="22"/>
         </w:rPr>
-        <w:t xml:space="preserve">The Client Recruiting domain covers all activities that generate awareness of CBM’s mentoring program and attract prospective clients. This includes direct outreach and marketing, management of partner organization relationships, and the planning and delivery of workshops and events. Partners and events are not separate domains — they are mechanisms within the single goal of connecting the right clients to CBM’s mentoring services.</w:t>
+        <w:t xml:space="preserve">The Client Recruiting domain covers all activities that generate awareness of CBM’s mentoring program and attract prospective clients. The domain is organized into four sub-domains — Partner Relationship Management, Outreach and Marketing, Workshops and Event Management, and Client Reactivation and Recovery — reflecting autonomous operational areas that share the common purpose of connecting the right clients to CBM’s mentoring services. The parent domain provides unified oversight, cross-sub-domain reporting, comparative channel effectiveness analysis, and a shared audience strategy for targeted community segments.</w:t>
       </w:r>
     </w:p>
     <w:p>
@@ -10258,7 +10371,20 @@
         <w:pStyle w:val="Heading3"/>
       </w:pPr>
       <w:r>
-        <w:t xml:space="preserve">Business Processes</w:t>
+        <w:t xml:space="preserve">Sub-Domains</w:t>
+      </w:r>
+    </w:p>
+    <w:p>
+      <w:pPr>
+        <w:spacing w:after="120"/>
+      </w:pPr>
+      <w:r>
+        <w:rPr>
+          <w:rFonts w:ascii="Arial" w:cs="Arial" w:eastAsia="Arial" w:hAnsi="Arial"/>
+          <w:sz w:val="22"/>
+          <w:szCs w:val="22"/>
+        </w:rPr>
+        <w:t xml:space="preserve">The Client Recruiting domain is organized into four sub-domains. Each sub-domain operates autonomously with its own process inventory, which will be defined during the Domain Overview and Sub-Domain Overview phases. Individual processes within each sub-domain are not enumerated here.</w:t>
       </w:r>
     </w:p>
     <w:p>
@@ -10278,7 +10404,305 @@
           <w:sz w:val="22"/>
           <w:szCs w:val="22"/>
         </w:rPr>
-        <w:t xml:space="preserve">CR-OUTREACH — Client Outreach and Marketing  </w:t>
+        <w:t xml:space="preserve">CR-PARTNER — Partner Relationship Management</w:t>
+      </w:r>
+    </w:p>
+    <w:tbl>
+      <w:tblPr>
+        <w:tblW w:type="dxa" w:w="1400"/>
+        <w:tblBorders>
+          <w:top w:val="single" w:color="auto" w:sz="4"/>
+          <w:left w:val="single" w:color="auto" w:sz="4"/>
+          <w:bottom w:val="single" w:color="auto" w:sz="4"/>
+          <w:right w:val="single" w:color="auto" w:sz="4"/>
+          <w:insideH w:val="single" w:color="auto" w:sz="4"/>
+          <w:insideV w:val="single" w:color="auto" w:sz="4"/>
+        </w:tblBorders>
+      </w:tblPr>
+      <w:tblGrid>
+        <w:gridCol w:w="1400"/>
+      </w:tblGrid>
+      <w:tr>
+        <w:tc>
+          <w:tcPr>
+            <w:tcW w:type="dxa" w:w="1400"/>
+            <w:tcBorders>
+              <w:top w:val="single" w:color="AAAAAA" w:sz="1"/>
+              <w:left w:val="single" w:color="AAAAAA" w:sz="1"/>
+              <w:bottom w:val="single" w:color="AAAAAA" w:sz="1"/>
+              <w:right w:val="single" w:color="AAAAAA" w:sz="1"/>
+            </w:tcBorders>
+            <w:shd w:fill="C6EFCE" w:val="clear"/>
+            <w:tcMar>
+              <w:top w:type="dxa" w:w="40"/>
+              <w:left w:type="dxa" w:w="80"/>
+              <w:bottom w:type="dxa" w:w="40"/>
+              <w:right w:type="dxa" w:w="80"/>
+            </w:tcMar>
+          </w:tcPr>
+          <w:p>
+            <w:pPr>
+              <w:jc w:val="center"/>
+            </w:pPr>
+            <w:r>
+              <w:rPr>
+                <w:rFonts w:ascii="Arial" w:cs="Arial" w:eastAsia="Arial" w:hAnsi="Arial"/>
+                <w:b/>
+                <w:bCs/>
+                <w:sz w:val="18"/>
+                <w:szCs w:val="18"/>
+              </w:rPr>
+              <w:t xml:space="preserve">Core</w:t>
+            </w:r>
+          </w:p>
+        </w:tc>
+      </w:tr>
+    </w:tbl>
+    <w:p>
+      <w:pPr>
+        <w:spacing w:after="120"/>
+      </w:pPr>
+      <w:r>
+        <w:rPr>
+          <w:rFonts w:ascii="Arial" w:cs="Arial" w:eastAsia="Arial" w:hAnsi="Arial"/>
+          <w:sz w:val="22"/>
+          <w:szCs w:val="22"/>
+        </w:rPr>
+        <w:t xml:space="preserve">The full lifecycle of referral partnerships — identifying potential partners, qualifying them, establishing formal agreements, onboarding partners, managing ongoing relationships, and measuring referral performance. Covers community organizations, nonprofits, government agencies, institutional channels (SBA, economic development offices, libraries, workforce development boards), and any organization that extends CBM’s reach and refers clients into the program.</w:t>
+      </w:r>
+    </w:p>
+    <w:p>
+      <w:pPr>
+        <w:pStyle w:val="Heading3"/>
+      </w:pPr>
+      <w:r>
+        <w:t xml:space="preserve">Business Value</w:t>
+      </w:r>
+    </w:p>
+    <w:p>
+      <w:pPr>
+        <w:pStyle w:val="ListParagraph"/>
+        <w:numPr>
+          <w:ilvl w:val="0"/>
+          <w:numId w:val="2"/>
+        </w:numPr>
+        <w:spacing w:after="60"/>
+      </w:pPr>
+      <w:r>
+        <w:rPr>
+          <w:rFonts w:ascii="Arial" w:cs="Arial" w:eastAsia="Arial" w:hAnsi="Arial"/>
+          <w:sz w:val="22"/>
+          <w:szCs w:val="22"/>
+        </w:rPr>
+        <w:t xml:space="preserve">Enables CBM to manage the full lifecycle of partner organization relationships — from prospecting through active collaboration</w:t>
+      </w:r>
+    </w:p>
+    <w:p>
+      <w:pPr>
+        <w:pStyle w:val="ListParagraph"/>
+        <w:numPr>
+          <w:ilvl w:val="0"/>
+          <w:numId w:val="2"/>
+        </w:numPr>
+        <w:spacing w:after="60"/>
+      </w:pPr>
+      <w:r>
+        <w:rPr>
+          <w:rFonts w:ascii="Arial" w:cs="Arial" w:eastAsia="Arial" w:hAnsi="Arial"/>
+          <w:sz w:val="22"/>
+          <w:szCs w:val="22"/>
+        </w:rPr>
+        <w:t xml:space="preserve">Provides complete visibility into agreements, referral activity, affiliated mentors, and co-sponsored programming</w:t>
+      </w:r>
+    </w:p>
+    <w:p>
+      <w:pPr>
+        <w:pStyle w:val="ListParagraph"/>
+        <w:numPr>
+          <w:ilvl w:val="0"/>
+          <w:numId w:val="2"/>
+        </w:numPr>
+        <w:spacing w:after="60"/>
+      </w:pPr>
+      <w:r>
+        <w:rPr>
+          <w:rFonts w:ascii="Arial" w:cs="Arial" w:eastAsia="Arial" w:hAnsi="Arial"/>
+          <w:sz w:val="22"/>
+          <w:szCs w:val="22"/>
+        </w:rPr>
+        <w:t xml:space="preserve">Partners are a primary referral channel for both clients and mentors, making this foundational to CBM’s reach</w:t>
+      </w:r>
+    </w:p>
+    <w:p>
+      <w:pPr>
+        <w:pStyle w:val="Heading3"/>
+      </w:pPr>
+      <w:r>
+        <w:t xml:space="preserve">Key Capabilities</w:t>
+      </w:r>
+    </w:p>
+    <w:p>
+      <w:pPr>
+        <w:pStyle w:val="ListParagraph"/>
+        <w:numPr>
+          <w:ilvl w:val="0"/>
+          <w:numId w:val="2"/>
+        </w:numPr>
+        <w:spacing w:after="60"/>
+      </w:pPr>
+      <w:r>
+        <w:rPr>
+          <w:rFonts w:ascii="Arial" w:cs="Arial" w:eastAsia="Arial" w:hAnsi="Arial"/>
+          <w:sz w:val="22"/>
+          <w:szCs w:val="22"/>
+        </w:rPr>
+        <w:t xml:space="preserve">Partner organization profile management with status lifecycle tracking</w:t>
+      </w:r>
+    </w:p>
+    <w:p>
+      <w:pPr>
+        <w:pStyle w:val="ListParagraph"/>
+        <w:numPr>
+          <w:ilvl w:val="0"/>
+          <w:numId w:val="2"/>
+        </w:numPr>
+        <w:spacing w:after="60"/>
+      </w:pPr>
+      <w:r>
+        <w:rPr>
+          <w:rFonts w:ascii="Arial" w:cs="Arial" w:eastAsia="Arial" w:hAnsi="Arial"/>
+          <w:sz w:val="22"/>
+          <w:szCs w:val="22"/>
+        </w:rPr>
+        <w:t xml:space="preserve">Multiple contacts per partner with primary designation</w:t>
+      </w:r>
+    </w:p>
+    <w:p>
+      <w:pPr>
+        <w:pStyle w:val="ListParagraph"/>
+        <w:numPr>
+          <w:ilvl w:val="0"/>
+          <w:numId w:val="2"/>
+        </w:numPr>
+        <w:spacing w:after="60"/>
+      </w:pPr>
+      <w:r>
+        <w:rPr>
+          <w:rFonts w:ascii="Arial" w:cs="Arial" w:eastAsia="Arial" w:hAnsi="Arial"/>
+          <w:sz w:val="22"/>
+          <w:szCs w:val="22"/>
+        </w:rPr>
+        <w:t xml:space="preserve">CBM coordinator assignment with lead designation</w:t>
+      </w:r>
+    </w:p>
+    <w:p>
+      <w:pPr>
+        <w:pStyle w:val="ListParagraph"/>
+        <w:numPr>
+          <w:ilvl w:val="0"/>
+          <w:numId w:val="2"/>
+        </w:numPr>
+        <w:spacing w:after="60"/>
+      </w:pPr>
+      <w:r>
+        <w:rPr>
+          <w:rFonts w:ascii="Arial" w:cs="Arial" w:eastAsia="Arial" w:hAnsi="Arial"/>
+          <w:sz w:val="22"/>
+          <w:szCs w:val="22"/>
+        </w:rPr>
+        <w:t xml:space="preserve">Partnership agreement tracking with dates, terms, and renewal schedule</w:t>
+      </w:r>
+    </w:p>
+    <w:p>
+      <w:pPr>
+        <w:pStyle w:val="ListParagraph"/>
+        <w:numPr>
+          <w:ilvl w:val="0"/>
+          <w:numId w:val="2"/>
+        </w:numPr>
+        <w:spacing w:after="60"/>
+      </w:pPr>
+      <w:r>
+        <w:rPr>
+          <w:rFonts w:ascii="Arial" w:cs="Arial" w:eastAsia="Arial" w:hAnsi="Arial"/>
+          <w:sz w:val="22"/>
+          <w:szCs w:val="22"/>
+        </w:rPr>
+        <w:t xml:space="preserve">Communication history across all CBM personnel</w:t>
+      </w:r>
+    </w:p>
+    <w:p>
+      <w:pPr>
+        <w:pStyle w:val="ListParagraph"/>
+        <w:numPr>
+          <w:ilvl w:val="0"/>
+          <w:numId w:val="2"/>
+        </w:numPr>
+        <w:spacing w:after="60"/>
+      </w:pPr>
+      <w:r>
+        <w:rPr>
+          <w:rFonts w:ascii="Arial" w:cs="Arial" w:eastAsia="Arial" w:hAnsi="Arial"/>
+          <w:sz w:val="22"/>
+          <w:szCs w:val="22"/>
+        </w:rPr>
+        <w:t xml:space="preserve">Client referral tracking by partner</w:t>
+      </w:r>
+    </w:p>
+    <w:p>
+      <w:pPr>
+        <w:pStyle w:val="ListParagraph"/>
+        <w:numPr>
+          <w:ilvl w:val="0"/>
+          <w:numId w:val="2"/>
+        </w:numPr>
+        <w:spacing w:after="60"/>
+      </w:pPr>
+      <w:r>
+        <w:rPr>
+          <w:rFonts w:ascii="Arial" w:cs="Arial" w:eastAsia="Arial" w:hAnsi="Arial"/>
+          <w:sz w:val="22"/>
+          <w:szCs w:val="22"/>
+        </w:rPr>
+        <w:t xml:space="preserve">Mentor affiliation tracking by partner and geography</w:t>
+      </w:r>
+    </w:p>
+    <w:p>
+      <w:pPr>
+        <w:pStyle w:val="ListParagraph"/>
+        <w:numPr>
+          <w:ilvl w:val="0"/>
+          <w:numId w:val="2"/>
+        </w:numPr>
+        <w:spacing w:after="60"/>
+      </w:pPr>
+      <w:r>
+        <w:rPr>
+          <w:rFonts w:ascii="Arial" w:cs="Arial" w:eastAsia="Arial" w:hAnsi="Arial"/>
+          <w:sz w:val="22"/>
+          <w:szCs w:val="22"/>
+        </w:rPr>
+        <w:t xml:space="preserve">Partner analytics reports</w:t>
+      </w:r>
+    </w:p>
+    <w:p>
+      <w:pPr>
+        <w:spacing w:after="0"/>
+      </w:pPr>
+    </w:p>
+    <w:p>
+      <w:pPr>
+        <w:spacing w:after="120"/>
+      </w:pPr>
+      <w:r>
+        <w:rPr>
+          <w:rFonts w:ascii="Arial" w:cs="Arial" w:eastAsia="Arial" w:hAnsi="Arial"/>
+          <w:b/>
+          <w:bCs/>
+          <w:sz w:val="22"/>
+          <w:szCs w:val="22"/>
+        </w:rPr>
+        <w:t xml:space="preserve">CR-MARKETING — Outreach and Marketing</w:t>
       </w:r>
     </w:p>
     <w:tbl>
@@ -10334,25 +10758,203 @@
     </w:tbl>
     <w:p>
       <w:pPr>
+        <w:spacing w:after="120"/>
+      </w:pPr>
+      <w:r>
+        <w:rPr>
+          <w:rFonts w:ascii="Arial" w:cs="Arial" w:eastAsia="Arial" w:hAnsi="Arial"/>
+          <w:sz w:val="22"/>
+          <w:szCs w:val="22"/>
+        </w:rPr>
+        <w:t xml:space="preserve">All activities that generate awareness and inbound interest through communications channels. Includes digital presence (search engine optimization, website, search advertising grants), content marketing, social media, email marketing, media and public relations (news stories, podcasts, radio, op-eds, press releases), paid advertising, and direct grassroots outreach (canvassing, flyers, direct mail to newly registered businesses, strategic signage). Also covers marketing contact list management and campaign performance tracking.</w:t>
+      </w:r>
+    </w:p>
+    <w:p>
+      <w:pPr>
+        <w:pStyle w:val="Heading3"/>
+      </w:pPr>
+      <w:r>
+        <w:t xml:space="preserve">Business Value</w:t>
+      </w:r>
+    </w:p>
+    <w:p>
+      <w:pPr>
+        <w:pStyle w:val="ListParagraph"/>
+        <w:numPr>
+          <w:ilvl w:val="0"/>
+          <w:numId w:val="2"/>
+        </w:numPr>
+        <w:spacing w:after="60"/>
+      </w:pPr>
+      <w:r>
+        <w:rPr>
+          <w:rFonts w:ascii="Arial" w:cs="Arial" w:eastAsia="Arial" w:hAnsi="Arial"/>
+          <w:sz w:val="22"/>
+          <w:szCs w:val="22"/>
+        </w:rPr>
+        <w:t xml:space="preserve">Gives the recruiting team a structured approach to tracking prospect contacts, outreach activity, and campaign performance</w:t>
+      </w:r>
+    </w:p>
+    <w:p>
+      <w:pPr>
+        <w:pStyle w:val="ListParagraph"/>
+        <w:numPr>
+          <w:ilvl w:val="0"/>
+          <w:numId w:val="2"/>
+        </w:numPr>
+        <w:spacing w:after="60"/>
+      </w:pPr>
+      <w:r>
+        <w:rPr>
+          <w:rFonts w:ascii="Arial" w:cs="Arial" w:eastAsia="Arial" w:hAnsi="Arial"/>
+          <w:sz w:val="22"/>
+          <w:szCs w:val="22"/>
+        </w:rPr>
+        <w:t xml:space="preserve">Enables data-driven decisions about where to focus marketing effort</w:t>
+      </w:r>
+    </w:p>
+    <w:p>
+      <w:pPr>
+        <w:pStyle w:val="ListParagraph"/>
+        <w:numPr>
+          <w:ilvl w:val="0"/>
+          <w:numId w:val="2"/>
+        </w:numPr>
+        <w:spacing w:after="60"/>
+      </w:pPr>
+      <w:r>
+        <w:rPr>
+          <w:rFonts w:ascii="Arial" w:cs="Arial" w:eastAsia="Arial" w:hAnsi="Arial"/>
+          <w:sz w:val="22"/>
+          <w:szCs w:val="22"/>
+        </w:rPr>
+        <w:t xml:space="preserve">Provides clear attribution of how clients discover CBM, supporting resource allocation across channels</w:t>
+      </w:r>
+    </w:p>
+    <w:p>
+      <w:pPr>
+        <w:pStyle w:val="Heading3"/>
+      </w:pPr>
+      <w:r>
+        <w:t xml:space="preserve">Key Capabilities</w:t>
+      </w:r>
+    </w:p>
+    <w:p>
+      <w:pPr>
+        <w:pStyle w:val="ListParagraph"/>
+        <w:numPr>
+          <w:ilvl w:val="0"/>
+          <w:numId w:val="2"/>
+        </w:numPr>
+        <w:spacing w:after="60"/>
+      </w:pPr>
+      <w:r>
+        <w:rPr>
+          <w:rFonts w:ascii="Arial" w:cs="Arial" w:eastAsia="Arial" w:hAnsi="Arial"/>
+          <w:sz w:val="22"/>
+          <w:szCs w:val="22"/>
+        </w:rPr>
+        <w:t xml:space="preserve">Prospect contact list management separate from active client records</w:t>
+      </w:r>
+    </w:p>
+    <w:p>
+      <w:pPr>
+        <w:pStyle w:val="ListParagraph"/>
+        <w:numPr>
+          <w:ilvl w:val="0"/>
+          <w:numId w:val="2"/>
+        </w:numPr>
+        <w:spacing w:after="60"/>
+      </w:pPr>
+      <w:r>
+        <w:rPr>
+          <w:rFonts w:ascii="Arial" w:cs="Arial" w:eastAsia="Arial" w:hAnsi="Arial"/>
+          <w:sz w:val="22"/>
+          <w:szCs w:val="22"/>
+        </w:rPr>
+        <w:t xml:space="preserve">Outreach activity and communication history tracking</w:t>
+      </w:r>
+    </w:p>
+    <w:p>
+      <w:pPr>
+        <w:pStyle w:val="ListParagraph"/>
+        <w:numPr>
+          <w:ilvl w:val="0"/>
+          <w:numId w:val="2"/>
+        </w:numPr>
+        <w:spacing w:after="60"/>
+      </w:pPr>
+      <w:r>
+        <w:rPr>
+          <w:rFonts w:ascii="Arial" w:cs="Arial" w:eastAsia="Arial" w:hAnsi="Arial"/>
+          <w:sz w:val="22"/>
+          <w:szCs w:val="22"/>
+        </w:rPr>
+        <w:t xml:space="preserve">Application source recording</w:t>
+      </w:r>
+    </w:p>
+    <w:p>
+      <w:pPr>
+        <w:pStyle w:val="ListParagraph"/>
+        <w:numPr>
+          <w:ilvl w:val="0"/>
+          <w:numId w:val="2"/>
+        </w:numPr>
+        <w:spacing w:after="60"/>
+      </w:pPr>
+      <w:r>
+        <w:rPr>
+          <w:rFonts w:ascii="Arial" w:cs="Arial" w:eastAsia="Arial" w:hAnsi="Arial"/>
+          <w:sz w:val="22"/>
+          <w:szCs w:val="22"/>
+        </w:rPr>
+        <w:t xml:space="preserve">Campaign reach and application volume trend tracking</w:t>
+      </w:r>
+    </w:p>
+    <w:p>
+      <w:pPr>
+        <w:pStyle w:val="ListParagraph"/>
+        <w:numPr>
+          <w:ilvl w:val="0"/>
+          <w:numId w:val="2"/>
+        </w:numPr>
+        <w:spacing w:after="60"/>
+      </w:pPr>
+      <w:r>
+        <w:rPr>
+          <w:rFonts w:ascii="Arial" w:cs="Arial" w:eastAsia="Arial" w:hAnsi="Arial"/>
+          <w:sz w:val="22"/>
+          <w:szCs w:val="22"/>
+        </w:rPr>
+        <w:t xml:space="preserve">Geographic targeting of outreach by service area</w:t>
+      </w:r>
+    </w:p>
+    <w:p>
+      <w:pPr>
+        <w:pStyle w:val="ListParagraph"/>
+        <w:numPr>
+          <w:ilvl w:val="0"/>
+          <w:numId w:val="2"/>
+        </w:numPr>
+        <w:spacing w:after="60"/>
+      </w:pPr>
+      <w:r>
+        <w:rPr>
+          <w:rFonts w:ascii="Arial" w:cs="Arial" w:eastAsia="Arial" w:hAnsi="Arial"/>
+          <w:sz w:val="22"/>
+          <w:szCs w:val="22"/>
+        </w:rPr>
+        <w:t xml:space="preserve">Media coverage and public relations activity tracking</w:t>
+      </w:r>
+    </w:p>
+    <w:p>
+      <w:pPr>
         <w:spacing w:after="0"/>
       </w:pPr>
     </w:p>
     <w:p>
       <w:pPr>
         <w:spacing w:after="120"/>
-      </w:pPr>
-      <w:r>
-        <w:rPr>
-          <w:rFonts w:ascii="Arial" w:cs="Arial" w:eastAsia="Arial" w:hAnsi="Arial"/>
-          <w:sz w:val="22"/>
-          <w:szCs w:val="22"/>
-        </w:rPr>
-        <w:t xml:space="preserve">The process of raising awareness of CBM’s mentoring program within the local business community through direct outreach and marketing campaigns.</w:t>
-      </w:r>
-    </w:p>
-    <w:p>
-      <w:pPr>
-        <w:spacing w:after="40"/>
       </w:pPr>
       <w:r>
         <w:rPr>
@@ -10362,531 +10964,7 @@
           <w:sz w:val="22"/>
           <w:szCs w:val="22"/>
         </w:rPr>
-        <w:t xml:space="preserve">Business Value:</w:t>
-      </w:r>
-    </w:p>
-    <w:p>
-      <w:pPr>
-        <w:pStyle w:val="ListParagraph"/>
-        <w:numPr>
-          <w:ilvl w:val="0"/>
-          <w:numId w:val="2"/>
-        </w:numPr>
-        <w:spacing w:after="40"/>
-      </w:pPr>
-      <w:r>
-        <w:rPr>
-          <w:rFonts w:ascii="Arial" w:cs="Arial" w:eastAsia="Arial" w:hAnsi="Arial"/>
-          <w:sz w:val="22"/>
-          <w:szCs w:val="22"/>
-        </w:rPr>
-        <w:t xml:space="preserve">Gives the recruiting team a structured approach to tracking prospect contacts, outreach activity, and campaign performance</w:t>
-      </w:r>
-    </w:p>
-    <w:p>
-      <w:pPr>
-        <w:pStyle w:val="ListParagraph"/>
-        <w:numPr>
-          <w:ilvl w:val="0"/>
-          <w:numId w:val="2"/>
-        </w:numPr>
-        <w:spacing w:after="40"/>
-      </w:pPr>
-      <w:r>
-        <w:rPr>
-          <w:rFonts w:ascii="Arial" w:cs="Arial" w:eastAsia="Arial" w:hAnsi="Arial"/>
-          <w:sz w:val="22"/>
-          <w:szCs w:val="22"/>
-        </w:rPr>
-        <w:t xml:space="preserve">Enables data-driven decisions about where to focus marketing effort</w:t>
-      </w:r>
-    </w:p>
-    <w:p>
-      <w:pPr>
-        <w:pStyle w:val="ListParagraph"/>
-        <w:numPr>
-          <w:ilvl w:val="0"/>
-          <w:numId w:val="2"/>
-        </w:numPr>
-        <w:spacing w:after="40"/>
-      </w:pPr>
-      <w:r>
-        <w:rPr>
-          <w:rFonts w:ascii="Arial" w:cs="Arial" w:eastAsia="Arial" w:hAnsi="Arial"/>
-          <w:sz w:val="22"/>
-          <w:szCs w:val="22"/>
-        </w:rPr>
-        <w:t xml:space="preserve">Provides clear attribution of how clients discover CBM, supporting resource allocation across channels</w:t>
-      </w:r>
-    </w:p>
-    <w:p>
-      <w:pPr>
-        <w:spacing w:after="0"/>
-      </w:pPr>
-    </w:p>
-    <w:p>
-      <w:pPr>
-        <w:spacing w:after="40"/>
-      </w:pPr>
-      <w:r>
-        <w:rPr>
-          <w:rFonts w:ascii="Arial" w:cs="Arial" w:eastAsia="Arial" w:hAnsi="Arial"/>
-          <w:b/>
-          <w:bCs/>
-          <w:sz w:val="22"/>
-          <w:szCs w:val="22"/>
-        </w:rPr>
-        <w:t xml:space="preserve">Key Capabilities:</w:t>
-      </w:r>
-    </w:p>
-    <w:p>
-      <w:pPr>
-        <w:pStyle w:val="ListParagraph"/>
-        <w:numPr>
-          <w:ilvl w:val="0"/>
-          <w:numId w:val="2"/>
-        </w:numPr>
-        <w:spacing w:after="40"/>
-      </w:pPr>
-      <w:r>
-        <w:rPr>
-          <w:rFonts w:ascii="Arial" w:cs="Arial" w:eastAsia="Arial" w:hAnsi="Arial"/>
-          <w:sz w:val="22"/>
-          <w:szCs w:val="22"/>
-        </w:rPr>
-        <w:t xml:space="preserve">Prospect contact list management separate from active client records</w:t>
-      </w:r>
-    </w:p>
-    <w:p>
-      <w:pPr>
-        <w:pStyle w:val="ListParagraph"/>
-        <w:numPr>
-          <w:ilvl w:val="0"/>
-          <w:numId w:val="2"/>
-        </w:numPr>
-        <w:spacing w:after="40"/>
-      </w:pPr>
-      <w:r>
-        <w:rPr>
-          <w:rFonts w:ascii="Arial" w:cs="Arial" w:eastAsia="Arial" w:hAnsi="Arial"/>
-          <w:sz w:val="22"/>
-          <w:szCs w:val="22"/>
-        </w:rPr>
-        <w:t xml:space="preserve">Outreach activity and communication history tracking</w:t>
-      </w:r>
-    </w:p>
-    <w:p>
-      <w:pPr>
-        <w:pStyle w:val="ListParagraph"/>
-        <w:numPr>
-          <w:ilvl w:val="0"/>
-          <w:numId w:val="2"/>
-        </w:numPr>
-        <w:spacing w:after="40"/>
-      </w:pPr>
-      <w:r>
-        <w:rPr>
-          <w:rFonts w:ascii="Arial" w:cs="Arial" w:eastAsia="Arial" w:hAnsi="Arial"/>
-          <w:sz w:val="22"/>
-          <w:szCs w:val="22"/>
-        </w:rPr>
-        <w:t xml:space="preserve">Application source recording</w:t>
-      </w:r>
-    </w:p>
-    <w:p>
-      <w:pPr>
-        <w:pStyle w:val="ListParagraph"/>
-        <w:numPr>
-          <w:ilvl w:val="0"/>
-          <w:numId w:val="2"/>
-        </w:numPr>
-        <w:spacing w:after="40"/>
-      </w:pPr>
-      <w:r>
-        <w:rPr>
-          <w:rFonts w:ascii="Arial" w:cs="Arial" w:eastAsia="Arial" w:hAnsi="Arial"/>
-          <w:sz w:val="22"/>
-          <w:szCs w:val="22"/>
-        </w:rPr>
-        <w:t xml:space="preserve">Campaign reach and application volume trend tracking</w:t>
-      </w:r>
-    </w:p>
-    <w:p>
-      <w:pPr>
-        <w:pStyle w:val="ListParagraph"/>
-        <w:numPr>
-          <w:ilvl w:val="0"/>
-          <w:numId w:val="2"/>
-        </w:numPr>
-        <w:spacing w:after="40"/>
-      </w:pPr>
-      <w:r>
-        <w:rPr>
-          <w:rFonts w:ascii="Arial" w:cs="Arial" w:eastAsia="Arial" w:hAnsi="Arial"/>
-          <w:sz w:val="22"/>
-          <w:szCs w:val="22"/>
-        </w:rPr>
-        <w:t xml:space="preserve">Geographic targeting of outreach by service area</w:t>
-      </w:r>
-    </w:p>
-    <w:p>
-      <w:pPr>
-        <w:spacing w:after="0"/>
-      </w:pPr>
-    </w:p>
-    <w:p>
-      <w:pPr>
-        <w:spacing w:after="120"/>
-      </w:pPr>
-      <w:r>
-        <w:rPr>
-          <w:rFonts w:ascii="Arial" w:cs="Arial" w:eastAsia="Arial" w:hAnsi="Arial"/>
-          <w:b/>
-          <w:bCs/>
-          <w:sz w:val="22"/>
-          <w:szCs w:val="22"/>
-        </w:rPr>
-        <w:t xml:space="preserve">CR-PARTNER — Partner Relationship Management  </w:t>
-      </w:r>
-    </w:p>
-    <w:tbl>
-      <w:tblPr>
-        <w:tblW w:type="dxa" w:w="1400"/>
-        <w:tblBorders>
-          <w:top w:val="single" w:color="auto" w:sz="4"/>
-          <w:left w:val="single" w:color="auto" w:sz="4"/>
-          <w:bottom w:val="single" w:color="auto" w:sz="4"/>
-          <w:right w:val="single" w:color="auto" w:sz="4"/>
-          <w:insideH w:val="single" w:color="auto" w:sz="4"/>
-          <w:insideV w:val="single" w:color="auto" w:sz="4"/>
-        </w:tblBorders>
-      </w:tblPr>
-      <w:tblGrid>
-        <w:gridCol w:w="1400"/>
-      </w:tblGrid>
-      <w:tr>
-        <w:tc>
-          <w:tcPr>
-            <w:tcW w:type="dxa" w:w="1400"/>
-            <w:tcBorders>
-              <w:top w:val="single" w:color="AAAAAA" w:sz="1"/>
-              <w:left w:val="single" w:color="AAAAAA" w:sz="1"/>
-              <w:bottom w:val="single" w:color="AAAAAA" w:sz="1"/>
-              <w:right w:val="single" w:color="AAAAAA" w:sz="1"/>
-            </w:tcBorders>
-            <w:shd w:fill="C6EFCE" w:val="clear"/>
-            <w:tcMar>
-              <w:top w:type="dxa" w:w="40"/>
-              <w:left w:type="dxa" w:w="80"/>
-              <w:bottom w:type="dxa" w:w="40"/>
-              <w:right w:type="dxa" w:w="80"/>
-            </w:tcMar>
-          </w:tcPr>
-          <w:p>
-            <w:pPr>
-              <w:jc w:val="center"/>
-            </w:pPr>
-            <w:r>
-              <w:rPr>
-                <w:rFonts w:ascii="Arial" w:cs="Arial" w:eastAsia="Arial" w:hAnsi="Arial"/>
-                <w:b/>
-                <w:bCs/>
-                <w:sz w:val="18"/>
-                <w:szCs w:val="18"/>
-              </w:rPr>
-              <w:t xml:space="preserve">Core</w:t>
-            </w:r>
-          </w:p>
-        </w:tc>
-      </w:tr>
-    </w:tbl>
-    <w:p>
-      <w:pPr>
-        <w:spacing w:after="0"/>
-      </w:pPr>
-    </w:p>
-    <w:p>
-      <w:pPr>
-        <w:spacing w:after="120"/>
-      </w:pPr>
-      <w:r>
-        <w:rPr>
-          <w:rFonts w:ascii="Arial" w:cs="Arial" w:eastAsia="Arial" w:hAnsi="Arial"/>
-          <w:sz w:val="22"/>
-          <w:szCs w:val="22"/>
-        </w:rPr>
-        <w:t xml:space="preserve">The process of identifying, recruiting, and managing relationships with community organizations that extend CBM’s reach and refer clients into the program.</w:t>
-      </w:r>
-    </w:p>
-    <w:p>
-      <w:pPr>
-        <w:spacing w:after="40"/>
-      </w:pPr>
-      <w:r>
-        <w:rPr>
-          <w:rFonts w:ascii="Arial" w:cs="Arial" w:eastAsia="Arial" w:hAnsi="Arial"/>
-          <w:b/>
-          <w:bCs/>
-          <w:sz w:val="22"/>
-          <w:szCs w:val="22"/>
-        </w:rPr>
-        <w:t xml:space="preserve">Business Value:</w:t>
-      </w:r>
-    </w:p>
-    <w:p>
-      <w:pPr>
-        <w:pStyle w:val="ListParagraph"/>
-        <w:numPr>
-          <w:ilvl w:val="0"/>
-          <w:numId w:val="2"/>
-        </w:numPr>
-        <w:spacing w:after="40"/>
-      </w:pPr>
-      <w:r>
-        <w:rPr>
-          <w:rFonts w:ascii="Arial" w:cs="Arial" w:eastAsia="Arial" w:hAnsi="Arial"/>
-          <w:sz w:val="22"/>
-          <w:szCs w:val="22"/>
-        </w:rPr>
-        <w:t xml:space="preserve">Enables CBM to manage the full lifecycle of partner organization relationships — from prospecting through active collaboration</w:t>
-      </w:r>
-    </w:p>
-    <w:p>
-      <w:pPr>
-        <w:pStyle w:val="ListParagraph"/>
-        <w:numPr>
-          <w:ilvl w:val="0"/>
-          <w:numId w:val="2"/>
-        </w:numPr>
-        <w:spacing w:after="40"/>
-      </w:pPr>
-      <w:r>
-        <w:rPr>
-          <w:rFonts w:ascii="Arial" w:cs="Arial" w:eastAsia="Arial" w:hAnsi="Arial"/>
-          <w:sz w:val="22"/>
-          <w:szCs w:val="22"/>
-        </w:rPr>
-        <w:t xml:space="preserve">Provides complete visibility into agreements, referral activity, affiliated mentors, and co-sponsored programming</w:t>
-      </w:r>
-    </w:p>
-    <w:p>
-      <w:pPr>
-        <w:pStyle w:val="ListParagraph"/>
-        <w:numPr>
-          <w:ilvl w:val="0"/>
-          <w:numId w:val="2"/>
-        </w:numPr>
-        <w:spacing w:after="40"/>
-      </w:pPr>
-      <w:r>
-        <w:rPr>
-          <w:rFonts w:ascii="Arial" w:cs="Arial" w:eastAsia="Arial" w:hAnsi="Arial"/>
-          <w:sz w:val="22"/>
-          <w:szCs w:val="22"/>
-        </w:rPr>
-        <w:t xml:space="preserve">Partners are a primary referral channel for both clients and mentors, making this foundational to CBM’s reach</w:t>
-      </w:r>
-    </w:p>
-    <w:p>
-      <w:pPr>
-        <w:spacing w:after="0"/>
-      </w:pPr>
-    </w:p>
-    <w:p>
-      <w:pPr>
-        <w:spacing w:after="40"/>
-      </w:pPr>
-      <w:r>
-        <w:rPr>
-          <w:rFonts w:ascii="Arial" w:cs="Arial" w:eastAsia="Arial" w:hAnsi="Arial"/>
-          <w:b/>
-          <w:bCs/>
-          <w:sz w:val="22"/>
-          <w:szCs w:val="22"/>
-        </w:rPr>
-        <w:t xml:space="preserve">Key Capabilities:</w:t>
-      </w:r>
-    </w:p>
-    <w:p>
-      <w:pPr>
-        <w:pStyle w:val="ListParagraph"/>
-        <w:numPr>
-          <w:ilvl w:val="0"/>
-          <w:numId w:val="2"/>
-        </w:numPr>
-        <w:spacing w:after="40"/>
-      </w:pPr>
-      <w:r>
-        <w:rPr>
-          <w:rFonts w:ascii="Arial" w:cs="Arial" w:eastAsia="Arial" w:hAnsi="Arial"/>
-          <w:sz w:val="22"/>
-          <w:szCs w:val="22"/>
-        </w:rPr>
-        <w:t xml:space="preserve">Partner organization profile management with status lifecycle tracking</w:t>
-      </w:r>
-    </w:p>
-    <w:p>
-      <w:pPr>
-        <w:pStyle w:val="ListParagraph"/>
-        <w:numPr>
-          <w:ilvl w:val="0"/>
-          <w:numId w:val="2"/>
-        </w:numPr>
-        <w:spacing w:after="40"/>
-      </w:pPr>
-      <w:r>
-        <w:rPr>
-          <w:rFonts w:ascii="Arial" w:cs="Arial" w:eastAsia="Arial" w:hAnsi="Arial"/>
-          <w:sz w:val="22"/>
-          <w:szCs w:val="22"/>
-        </w:rPr>
-        <w:t xml:space="preserve">Multiple contacts per partner with primary designation</w:t>
-      </w:r>
-    </w:p>
-    <w:p>
-      <w:pPr>
-        <w:pStyle w:val="ListParagraph"/>
-        <w:numPr>
-          <w:ilvl w:val="0"/>
-          <w:numId w:val="2"/>
-        </w:numPr>
-        <w:spacing w:after="40"/>
-      </w:pPr>
-      <w:r>
-        <w:rPr>
-          <w:rFonts w:ascii="Arial" w:cs="Arial" w:eastAsia="Arial" w:hAnsi="Arial"/>
-          <w:sz w:val="22"/>
-          <w:szCs w:val="22"/>
-        </w:rPr>
-        <w:t xml:space="preserve">CBM coordinator assignment with lead designation</w:t>
-      </w:r>
-    </w:p>
-    <w:p>
-      <w:pPr>
-        <w:pStyle w:val="ListParagraph"/>
-        <w:numPr>
-          <w:ilvl w:val="0"/>
-          <w:numId w:val="2"/>
-        </w:numPr>
-        <w:spacing w:after="40"/>
-      </w:pPr>
-      <w:r>
-        <w:rPr>
-          <w:rFonts w:ascii="Arial" w:cs="Arial" w:eastAsia="Arial" w:hAnsi="Arial"/>
-          <w:sz w:val="22"/>
-          <w:szCs w:val="22"/>
-        </w:rPr>
-        <w:t xml:space="preserve">Partnership agreement tracking with dates, terms, and renewal schedule</w:t>
-      </w:r>
-    </w:p>
-    <w:p>
-      <w:pPr>
-        <w:pStyle w:val="ListParagraph"/>
-        <w:numPr>
-          <w:ilvl w:val="0"/>
-          <w:numId w:val="2"/>
-        </w:numPr>
-        <w:spacing w:after="40"/>
-      </w:pPr>
-      <w:r>
-        <w:rPr>
-          <w:rFonts w:ascii="Arial" w:cs="Arial" w:eastAsia="Arial" w:hAnsi="Arial"/>
-          <w:sz w:val="22"/>
-          <w:szCs w:val="22"/>
-        </w:rPr>
-        <w:t xml:space="preserve">Communication history across all CBM personnel</w:t>
-      </w:r>
-    </w:p>
-    <w:p>
-      <w:pPr>
-        <w:pStyle w:val="ListParagraph"/>
-        <w:numPr>
-          <w:ilvl w:val="0"/>
-          <w:numId w:val="2"/>
-        </w:numPr>
-        <w:spacing w:after="40"/>
-      </w:pPr>
-      <w:r>
-        <w:rPr>
-          <w:rFonts w:ascii="Arial" w:cs="Arial" w:eastAsia="Arial" w:hAnsi="Arial"/>
-          <w:sz w:val="22"/>
-          <w:szCs w:val="22"/>
-        </w:rPr>
-        <w:t xml:space="preserve">Client referral tracking by partner</w:t>
-      </w:r>
-    </w:p>
-    <w:p>
-      <w:pPr>
-        <w:pStyle w:val="ListParagraph"/>
-        <w:numPr>
-          <w:ilvl w:val="0"/>
-          <w:numId w:val="2"/>
-        </w:numPr>
-        <w:spacing w:after="40"/>
-      </w:pPr>
-      <w:r>
-        <w:rPr>
-          <w:rFonts w:ascii="Arial" w:cs="Arial" w:eastAsia="Arial" w:hAnsi="Arial"/>
-          <w:sz w:val="22"/>
-          <w:szCs w:val="22"/>
-        </w:rPr>
-        <w:t xml:space="preserve">Mentor affiliation tracking by partner and geography</w:t>
-      </w:r>
-    </w:p>
-    <w:p>
-      <w:pPr>
-        <w:pStyle w:val="ListParagraph"/>
-        <w:numPr>
-          <w:ilvl w:val="0"/>
-          <w:numId w:val="2"/>
-        </w:numPr>
-        <w:spacing w:after="40"/>
-      </w:pPr>
-      <w:r>
-        <w:rPr>
-          <w:rFonts w:ascii="Arial" w:cs="Arial" w:eastAsia="Arial" w:hAnsi="Arial"/>
-          <w:sz w:val="22"/>
-          <w:szCs w:val="22"/>
-        </w:rPr>
-        <w:t xml:space="preserve">Partner analytics reports</w:t>
-      </w:r>
-    </w:p>
-    <w:p>
-      <w:pPr>
-        <w:pStyle w:val="ListParagraph"/>
-        <w:numPr>
-          <w:ilvl w:val="0"/>
-          <w:numId w:val="2"/>
-        </w:numPr>
-        <w:spacing w:after="40"/>
-      </w:pPr>
-      <w:r>
-        <w:rPr>
-          <w:rFonts w:ascii="Arial" w:cs="Arial" w:eastAsia="Arial" w:hAnsi="Arial"/>
-          <w:sz w:val="22"/>
-          <w:szCs w:val="22"/>
-        </w:rPr>
-        <w:t xml:space="preserve">Administrator notes</w:t>
-      </w:r>
-    </w:p>
-    <w:p>
-      <w:pPr>
-        <w:spacing w:after="0"/>
-      </w:pPr>
-    </w:p>
-    <w:p>
-      <w:pPr>
-        <w:spacing w:after="120"/>
-      </w:pPr>
-      <w:r>
-        <w:rPr>
-          <w:rFonts w:ascii="Arial" w:cs="Arial" w:eastAsia="Arial" w:hAnsi="Arial"/>
-          <w:b/>
-          <w:bCs/>
-          <w:sz w:val="22"/>
-          <w:szCs w:val="22"/>
-        </w:rPr>
-        <w:t xml:space="preserve">CR-EVENTS — Workshop and Event Management  </w:t>
+        <w:t xml:space="preserve">CR-EVENTS — Workshops and Event Management</w:t>
       </w:r>
     </w:p>
     <w:tbl>
@@ -10942,25 +11020,221 @@
     </w:tbl>
     <w:p>
       <w:pPr>
+        <w:spacing w:after="120"/>
+      </w:pPr>
+      <w:r>
+        <w:rPr>
+          <w:rFonts w:ascii="Arial" w:cs="Arial" w:eastAsia="Arial" w:hAnsi="Arial"/>
+          <w:sz w:val="22"/>
+          <w:szCs w:val="22"/>
+        </w:rPr>
+        <w:t xml:space="preserve">The planning, delivery, and follow-up of all client-facing events in both in-person and virtual formats. In-person events include workshops, seminars, open houses, speaking engagements, pop-up presence at community events, business expos, and community college and trade school visits. Virtual events include webinars and online workshops. Covers event logistics, registration, attendance tracking, post-event follow-up, and conversion tracking from attendee to applicant.</w:t>
+      </w:r>
+    </w:p>
+    <w:p>
+      <w:pPr>
+        <w:pStyle w:val="Heading3"/>
+      </w:pPr>
+      <w:r>
+        <w:t xml:space="preserve">Business Value</w:t>
+      </w:r>
+    </w:p>
+    <w:p>
+      <w:pPr>
+        <w:pStyle w:val="ListParagraph"/>
+        <w:numPr>
+          <w:ilvl w:val="0"/>
+          <w:numId w:val="2"/>
+        </w:numPr>
+        <w:spacing w:after="60"/>
+      </w:pPr>
+      <w:r>
+        <w:rPr>
+          <w:rFonts w:ascii="Arial" w:cs="Arial" w:eastAsia="Arial" w:hAnsi="Arial"/>
+          <w:sz w:val="22"/>
+          <w:szCs w:val="22"/>
+        </w:rPr>
+        <w:t xml:space="preserve">Provides end-to-end management of workshops, clinics, webinars, and events including scheduling, registration, attendance tracking, and post-event reporting</w:t>
+      </w:r>
+    </w:p>
+    <w:p>
+      <w:pPr>
+        <w:pStyle w:val="ListParagraph"/>
+        <w:numPr>
+          <w:ilvl w:val="0"/>
+          <w:numId w:val="2"/>
+        </w:numPr>
+        <w:spacing w:after="60"/>
+      </w:pPr>
+      <w:r>
+        <w:rPr>
+          <w:rFonts w:ascii="Arial" w:cs="Arial" w:eastAsia="Arial" w:hAnsi="Arial"/>
+          <w:sz w:val="22"/>
+          <w:szCs w:val="22"/>
+        </w:rPr>
+        <w:t xml:space="preserve">Enables CBM to measure which events are driving client engagement and partner collaboration</w:t>
+      </w:r>
+    </w:p>
+    <w:p>
+      <w:pPr>
+        <w:pStyle w:val="Heading3"/>
+      </w:pPr>
+      <w:r>
+        <w:t xml:space="preserve">Key Capabilities</w:t>
+      </w:r>
+    </w:p>
+    <w:p>
+      <w:pPr>
+        <w:pStyle w:val="ListParagraph"/>
+        <w:numPr>
+          <w:ilvl w:val="0"/>
+          <w:numId w:val="2"/>
+        </w:numPr>
+        <w:spacing w:after="60"/>
+      </w:pPr>
+      <w:r>
+        <w:rPr>
+          <w:rFonts w:ascii="Arial" w:cs="Arial" w:eastAsia="Arial" w:hAnsi="Arial"/>
+          <w:sz w:val="22"/>
+          <w:szCs w:val="22"/>
+        </w:rPr>
+        <w:t xml:space="preserve">Event record management (name, date, location, type, format, capacity, status)</w:t>
+      </w:r>
+    </w:p>
+    <w:p>
+      <w:pPr>
+        <w:pStyle w:val="ListParagraph"/>
+        <w:numPr>
+          <w:ilvl w:val="0"/>
+          <w:numId w:val="2"/>
+        </w:numPr>
+        <w:spacing w:after="60"/>
+      </w:pPr>
+      <w:r>
+        <w:rPr>
+          <w:rFonts w:ascii="Arial" w:cs="Arial" w:eastAsia="Arial" w:hAnsi="Arial"/>
+          <w:sz w:val="22"/>
+          <w:szCs w:val="22"/>
+        </w:rPr>
+        <w:t xml:space="preserve">Registration management with confirmations, reminders, waitlists, and attendance tracking</w:t>
+      </w:r>
+    </w:p>
+    <w:p>
+      <w:pPr>
+        <w:pStyle w:val="ListParagraph"/>
+        <w:numPr>
+          <w:ilvl w:val="0"/>
+          <w:numId w:val="2"/>
+        </w:numPr>
+        <w:spacing w:after="60"/>
+      </w:pPr>
+      <w:r>
+        <w:rPr>
+          <w:rFonts w:ascii="Arial" w:cs="Arial" w:eastAsia="Arial" w:hAnsi="Arial"/>
+          <w:sz w:val="22"/>
+          <w:szCs w:val="22"/>
+        </w:rPr>
+        <w:t xml:space="preserve">No-show rate and attendance trend tracking</w:t>
+      </w:r>
+    </w:p>
+    <w:p>
+      <w:pPr>
+        <w:pStyle w:val="ListParagraph"/>
+        <w:numPr>
+          <w:ilvl w:val="0"/>
+          <w:numId w:val="2"/>
+        </w:numPr>
+        <w:spacing w:after="60"/>
+      </w:pPr>
+      <w:r>
+        <w:rPr>
+          <w:rFonts w:ascii="Arial" w:cs="Arial" w:eastAsia="Arial" w:hAnsi="Arial"/>
+          <w:sz w:val="22"/>
+          <w:szCs w:val="22"/>
+        </w:rPr>
+        <w:t xml:space="preserve">Partner and sponsor linking to co-sponsored and sponsored events</w:t>
+      </w:r>
+    </w:p>
+    <w:p>
+      <w:pPr>
+        <w:pStyle w:val="ListParagraph"/>
+        <w:numPr>
+          <w:ilvl w:val="0"/>
+          <w:numId w:val="2"/>
+        </w:numPr>
+        <w:spacing w:after="60"/>
+      </w:pPr>
+      <w:r>
+        <w:rPr>
+          <w:rFonts w:ascii="Arial" w:cs="Arial" w:eastAsia="Arial" w:hAnsi="Arial"/>
+          <w:sz w:val="22"/>
+          <w:szCs w:val="22"/>
+        </w:rPr>
+        <w:t xml:space="preserve">Presenter tracking linked to contact records</w:t>
+      </w:r>
+    </w:p>
+    <w:p>
+      <w:pPr>
+        <w:pStyle w:val="ListParagraph"/>
+        <w:numPr>
+          <w:ilvl w:val="0"/>
+          <w:numId w:val="2"/>
+        </w:numPr>
+        <w:spacing w:after="60"/>
+      </w:pPr>
+      <w:r>
+        <w:rPr>
+          <w:rFonts w:ascii="Arial" w:cs="Arial" w:eastAsia="Arial" w:hAnsi="Arial"/>
+          <w:sz w:val="22"/>
+          <w:szCs w:val="22"/>
+        </w:rPr>
+        <w:t xml:space="preserve">Event document storage</w:t>
+      </w:r>
+    </w:p>
+    <w:p>
+      <w:pPr>
+        <w:pStyle w:val="ListParagraph"/>
+        <w:numPr>
+          <w:ilvl w:val="0"/>
+          <w:numId w:val="2"/>
+        </w:numPr>
+        <w:spacing w:after="60"/>
+      </w:pPr>
+      <w:r>
+        <w:rPr>
+          <w:rFonts w:ascii="Arial" w:cs="Arial" w:eastAsia="Arial" w:hAnsi="Arial"/>
+          <w:sz w:val="22"/>
+          <w:szCs w:val="22"/>
+        </w:rPr>
+        <w:t xml:space="preserve">Event analytics reports</w:t>
+      </w:r>
+    </w:p>
+    <w:p>
+      <w:pPr>
+        <w:pStyle w:val="ListParagraph"/>
+        <w:numPr>
+          <w:ilvl w:val="0"/>
+          <w:numId w:val="2"/>
+        </w:numPr>
+        <w:spacing w:after="60"/>
+      </w:pPr>
+      <w:r>
+        <w:rPr>
+          <w:rFonts w:ascii="Arial" w:cs="Arial" w:eastAsia="Arial" w:hAnsi="Arial"/>
+          <w:sz w:val="22"/>
+          <w:szCs w:val="22"/>
+        </w:rPr>
+        <w:t xml:space="preserve">Post-event follow-up and conversion tracking</w:t>
+      </w:r>
+    </w:p>
+    <w:p>
+      <w:pPr>
         <w:spacing w:after="0"/>
       </w:pPr>
     </w:p>
     <w:p>
       <w:pPr>
         <w:spacing w:after="120"/>
-      </w:pPr>
-      <w:r>
-        <w:rPr>
-          <w:rFonts w:ascii="Arial" w:cs="Arial" w:eastAsia="Arial" w:hAnsi="Arial"/>
-          <w:sz w:val="22"/>
-          <w:szCs w:val="22"/>
-        </w:rPr>
-        <w:t xml:space="preserve">The process of planning, delivering, and reporting on workshops, events, and clinics that build awareness and attract prospective clients.</w:t>
-      </w:r>
-    </w:p>
-    <w:p>
-      <w:pPr>
-        <w:spacing w:after="40"/>
       </w:pPr>
       <w:r>
         <w:rPr>
@@ -10970,201 +11244,220 @@
           <w:sz w:val="22"/>
           <w:szCs w:val="22"/>
         </w:rPr>
-        <w:t xml:space="preserve">Business Value:</w:t>
-      </w:r>
-    </w:p>
-    <w:p>
-      <w:pPr>
-        <w:pStyle w:val="ListParagraph"/>
-        <w:numPr>
-          <w:ilvl w:val="0"/>
-          <w:numId w:val="2"/>
-        </w:numPr>
-        <w:spacing w:after="40"/>
-      </w:pPr>
-      <w:r>
-        <w:rPr>
-          <w:rFonts w:ascii="Arial" w:cs="Arial" w:eastAsia="Arial" w:hAnsi="Arial"/>
-          <w:sz w:val="22"/>
-          <w:szCs w:val="22"/>
-        </w:rPr>
-        <w:t xml:space="preserve">Provides end-to-end management of workshops, clinics, and events including scheduling, registration, attendance tracking, and post-event reporting</w:t>
-      </w:r>
-    </w:p>
-    <w:p>
-      <w:pPr>
-        <w:pStyle w:val="ListParagraph"/>
-        <w:numPr>
-          <w:ilvl w:val="0"/>
-          <w:numId w:val="2"/>
-        </w:numPr>
-        <w:spacing w:after="40"/>
-      </w:pPr>
-      <w:r>
-        <w:rPr>
-          <w:rFonts w:ascii="Arial" w:cs="Arial" w:eastAsia="Arial" w:hAnsi="Arial"/>
-          <w:sz w:val="22"/>
-          <w:szCs w:val="22"/>
-        </w:rPr>
-        <w:t xml:space="preserve">Enables CBM to measure which events are driving client engagement and partner collaboration</w:t>
-      </w:r>
-    </w:p>
-    <w:p>
-      <w:pPr>
-        <w:spacing w:after="0"/>
-      </w:pPr>
-    </w:p>
-    <w:p>
-      <w:pPr>
-        <w:spacing w:after="40"/>
-      </w:pPr>
-      <w:r>
-        <w:rPr>
-          <w:rFonts w:ascii="Arial" w:cs="Arial" w:eastAsia="Arial" w:hAnsi="Arial"/>
-          <w:b/>
-          <w:bCs/>
-          <w:sz w:val="22"/>
-          <w:szCs w:val="22"/>
-        </w:rPr>
-        <w:t xml:space="preserve">Key Capabilities:</w:t>
-      </w:r>
-    </w:p>
-    <w:p>
-      <w:pPr>
-        <w:pStyle w:val="ListParagraph"/>
-        <w:numPr>
-          <w:ilvl w:val="0"/>
-          <w:numId w:val="2"/>
-        </w:numPr>
-        <w:spacing w:after="40"/>
-      </w:pPr>
-      <w:r>
-        <w:rPr>
-          <w:rFonts w:ascii="Arial" w:cs="Arial" w:eastAsia="Arial" w:hAnsi="Arial"/>
-          <w:sz w:val="22"/>
-          <w:szCs w:val="22"/>
-        </w:rPr>
-        <w:t xml:space="preserve">Event record management (name, date, location, type, capacity, status)</w:t>
-      </w:r>
-    </w:p>
-    <w:p>
-      <w:pPr>
-        <w:pStyle w:val="ListParagraph"/>
-        <w:numPr>
-          <w:ilvl w:val="0"/>
-          <w:numId w:val="2"/>
-        </w:numPr>
-        <w:spacing w:after="40"/>
-      </w:pPr>
-      <w:r>
-        <w:rPr>
-          <w:rFonts w:ascii="Arial" w:cs="Arial" w:eastAsia="Arial" w:hAnsi="Arial"/>
-          <w:sz w:val="22"/>
-          <w:szCs w:val="22"/>
-        </w:rPr>
-        <w:t xml:space="preserve">Registration management with confirmations, reminders, waitlists, and attendance tracking</w:t>
-      </w:r>
-    </w:p>
-    <w:p>
-      <w:pPr>
-        <w:pStyle w:val="ListParagraph"/>
-        <w:numPr>
-          <w:ilvl w:val="0"/>
-          <w:numId w:val="2"/>
-        </w:numPr>
-        <w:spacing w:after="40"/>
-      </w:pPr>
-      <w:r>
-        <w:rPr>
-          <w:rFonts w:ascii="Arial" w:cs="Arial" w:eastAsia="Arial" w:hAnsi="Arial"/>
-          <w:sz w:val="22"/>
-          <w:szCs w:val="22"/>
-        </w:rPr>
-        <w:t xml:space="preserve">No-show rate and attendance trend tracking</w:t>
-      </w:r>
-    </w:p>
-    <w:p>
-      <w:pPr>
-        <w:pStyle w:val="ListParagraph"/>
-        <w:numPr>
-          <w:ilvl w:val="0"/>
-          <w:numId w:val="2"/>
-        </w:numPr>
-        <w:spacing w:after="40"/>
-      </w:pPr>
-      <w:r>
-        <w:rPr>
-          <w:rFonts w:ascii="Arial" w:cs="Arial" w:eastAsia="Arial" w:hAnsi="Arial"/>
-          <w:sz w:val="22"/>
-          <w:szCs w:val="22"/>
-        </w:rPr>
-        <w:t xml:space="preserve">Partner and sponsor linking to co-sponsored and sponsored events</w:t>
-      </w:r>
-    </w:p>
-    <w:p>
-      <w:pPr>
-        <w:pStyle w:val="ListParagraph"/>
-        <w:numPr>
-          <w:ilvl w:val="0"/>
-          <w:numId w:val="2"/>
-        </w:numPr>
-        <w:spacing w:after="40"/>
-      </w:pPr>
-      <w:r>
-        <w:rPr>
-          <w:rFonts w:ascii="Arial" w:cs="Arial" w:eastAsia="Arial" w:hAnsi="Arial"/>
-          <w:sz w:val="22"/>
-          <w:szCs w:val="22"/>
-        </w:rPr>
-        <w:t xml:space="preserve">Presenter tracking linked to contact records</w:t>
-      </w:r>
-    </w:p>
-    <w:p>
-      <w:pPr>
-        <w:pStyle w:val="ListParagraph"/>
-        <w:numPr>
-          <w:ilvl w:val="0"/>
-          <w:numId w:val="2"/>
-        </w:numPr>
-        <w:spacing w:after="40"/>
-      </w:pPr>
-      <w:r>
-        <w:rPr>
-          <w:rFonts w:ascii="Arial" w:cs="Arial" w:eastAsia="Arial" w:hAnsi="Arial"/>
-          <w:sz w:val="22"/>
-          <w:szCs w:val="22"/>
-        </w:rPr>
-        <w:t xml:space="preserve">Event document storage</w:t>
-      </w:r>
-    </w:p>
-    <w:p>
-      <w:pPr>
-        <w:pStyle w:val="ListParagraph"/>
-        <w:numPr>
-          <w:ilvl w:val="0"/>
-          <w:numId w:val="2"/>
-        </w:numPr>
-        <w:spacing w:after="40"/>
-      </w:pPr>
-      <w:r>
-        <w:rPr>
-          <w:rFonts w:ascii="Arial" w:cs="Arial" w:eastAsia="Arial" w:hAnsi="Arial"/>
-          <w:sz w:val="22"/>
-          <w:szCs w:val="22"/>
-        </w:rPr>
-        <w:t xml:space="preserve">Event analytics reports</w:t>
-      </w:r>
-    </w:p>
-    <w:p>
-      <w:pPr>
-        <w:spacing w:after="0"/>
-      </w:pPr>
+        <w:t xml:space="preserve">CR-REACTIVATE — Client Reactivation and Recovery</w:t>
+      </w:r>
+    </w:p>
+    <w:tbl>
+      <w:tblPr>
+        <w:tblW w:type="dxa" w:w="1400"/>
+        <w:tblBorders>
+          <w:top w:val="single" w:color="auto" w:sz="4"/>
+          <w:left w:val="single" w:color="auto" w:sz="4"/>
+          <w:bottom w:val="single" w:color="auto" w:sz="4"/>
+          <w:right w:val="single" w:color="auto" w:sz="4"/>
+          <w:insideH w:val="single" w:color="auto" w:sz="4"/>
+          <w:insideV w:val="single" w:color="auto" w:sz="4"/>
+        </w:tblBorders>
+      </w:tblPr>
+      <w:tblGrid>
+        <w:gridCol w:w="1400"/>
+      </w:tblGrid>
+      <w:tr>
+        <w:tc>
+          <w:tcPr>
+            <w:tcW w:type="dxa" w:w="1400"/>
+            <w:tcBorders>
+              <w:top w:val="single" w:color="AAAAAA" w:sz="1"/>
+              <w:left w:val="single" w:color="AAAAAA" w:sz="1"/>
+              <w:bottom w:val="single" w:color="AAAAAA" w:sz="1"/>
+              <w:right w:val="single" w:color="AAAAAA" w:sz="1"/>
+            </w:tcBorders>
+            <w:shd w:fill="BDD7EE" w:val="clear"/>
+            <w:tcMar>
+              <w:top w:type="dxa" w:w="40"/>
+              <w:left w:type="dxa" w:w="80"/>
+              <w:bottom w:type="dxa" w:w="40"/>
+              <w:right w:type="dxa" w:w="80"/>
+            </w:tcMar>
+          </w:tcPr>
+          <w:p>
+            <w:pPr>
+              <w:jc w:val="center"/>
+            </w:pPr>
+            <w:r>
+              <w:rPr>
+                <w:rFonts w:ascii="Arial" w:cs="Arial" w:eastAsia="Arial" w:hAnsi="Arial"/>
+                <w:b/>
+                <w:bCs/>
+                <w:sz w:val="18"/>
+                <w:szCs w:val="18"/>
+              </w:rPr>
+              <w:t xml:space="preserve">Important</w:t>
+            </w:r>
+          </w:p>
+        </w:tc>
+      </w:tr>
+    </w:tbl>
+    <w:p>
+      <w:pPr>
+        <w:spacing w:after="120"/>
+      </w:pPr>
+      <w:r>
+        <w:rPr>
+          <w:rFonts w:ascii="Arial" w:cs="Arial" w:eastAsia="Arial" w:hAnsi="Arial"/>
+          <w:sz w:val="22"/>
+          <w:szCs w:val="22"/>
+        </w:rPr>
+        <w:t xml:space="preserve">Re-engaging people who have previously interacted with CBM but are not currently active. Includes former clients who may benefit from another round of mentoring, incomplete applications, workshop and webinar attendees who did not convert to applicants, seasonal and cyclical outreach to past inquiries, and structured referral requests to successful former clients.</w:t>
+      </w:r>
     </w:p>
     <w:p>
       <w:pPr>
         <w:pStyle w:val="Heading3"/>
       </w:pPr>
       <w:r>
+        <w:t xml:space="preserve">Business Value</w:t>
+      </w:r>
+    </w:p>
+    <w:p>
+      <w:pPr>
+        <w:pStyle w:val="ListParagraph"/>
+        <w:numPr>
+          <w:ilvl w:val="0"/>
+          <w:numId w:val="2"/>
+        </w:numPr>
+        <w:spacing w:after="60"/>
+      </w:pPr>
+      <w:r>
+        <w:rPr>
+          <w:rFonts w:ascii="Arial" w:cs="Arial" w:eastAsia="Arial" w:hAnsi="Arial"/>
+          <w:sz w:val="22"/>
+          <w:szCs w:val="22"/>
+        </w:rPr>
+        <w:t xml:space="preserve">Maximizes return on prior recruiting investment by converting warm leads who already know CBM</w:t>
+      </w:r>
+    </w:p>
+    <w:p>
+      <w:pPr>
+        <w:pStyle w:val="ListParagraph"/>
+        <w:numPr>
+          <w:ilvl w:val="0"/>
+          <w:numId w:val="2"/>
+        </w:numPr>
+        <w:spacing w:after="60"/>
+      </w:pPr>
+      <w:r>
+        <w:rPr>
+          <w:rFonts w:ascii="Arial" w:cs="Arial" w:eastAsia="Arial" w:hAnsi="Arial"/>
+          <w:sz w:val="22"/>
+          <w:szCs w:val="22"/>
+        </w:rPr>
+        <w:t xml:space="preserve">Turns satisfied former clients into active referral sources through structured alumni engagement</w:t>
+      </w:r>
+    </w:p>
+    <w:p>
+      <w:pPr>
+        <w:pStyle w:val="Heading3"/>
+      </w:pPr>
+      <w:r>
+        <w:t xml:space="preserve">Key Capabilities</w:t>
+      </w:r>
+    </w:p>
+    <w:p>
+      <w:pPr>
+        <w:pStyle w:val="ListParagraph"/>
+        <w:numPr>
+          <w:ilvl w:val="0"/>
+          <w:numId w:val="2"/>
+        </w:numPr>
+        <w:spacing w:after="60"/>
+      </w:pPr>
+      <w:r>
+        <w:rPr>
+          <w:rFonts w:ascii="Arial" w:cs="Arial" w:eastAsia="Arial" w:hAnsi="Arial"/>
+          <w:sz w:val="22"/>
+          <w:szCs w:val="22"/>
+        </w:rPr>
+        <w:t xml:space="preserve">Alumni contact tracking and periodic re-engagement outreach</w:t>
+      </w:r>
+    </w:p>
+    <w:p>
+      <w:pPr>
+        <w:pStyle w:val="ListParagraph"/>
+        <w:numPr>
+          <w:ilvl w:val="0"/>
+          <w:numId w:val="2"/>
+        </w:numPr>
+        <w:spacing w:after="60"/>
+      </w:pPr>
+      <w:r>
+        <w:rPr>
+          <w:rFonts w:ascii="Arial" w:cs="Arial" w:eastAsia="Arial" w:hAnsi="Arial"/>
+          <w:sz w:val="22"/>
+          <w:szCs w:val="22"/>
+        </w:rPr>
+        <w:t xml:space="preserve">Incomplete application follow-up tracking</w:t>
+      </w:r>
+    </w:p>
+    <w:p>
+      <w:pPr>
+        <w:pStyle w:val="ListParagraph"/>
+        <w:numPr>
+          <w:ilvl w:val="0"/>
+          <w:numId w:val="2"/>
+        </w:numPr>
+        <w:spacing w:after="60"/>
+      </w:pPr>
+      <w:r>
+        <w:rPr>
+          <w:rFonts w:ascii="Arial" w:cs="Arial" w:eastAsia="Arial" w:hAnsi="Arial"/>
+          <w:sz w:val="22"/>
+          <w:szCs w:val="22"/>
+        </w:rPr>
+        <w:t xml:space="preserve">Event attendee conversion tracking</w:t>
+      </w:r>
+    </w:p>
+    <w:p>
+      <w:pPr>
+        <w:pStyle w:val="ListParagraph"/>
+        <w:numPr>
+          <w:ilvl w:val="0"/>
+          <w:numId w:val="2"/>
+        </w:numPr>
+        <w:spacing w:after="60"/>
+      </w:pPr>
+      <w:r>
+        <w:rPr>
+          <w:rFonts w:ascii="Arial" w:cs="Arial" w:eastAsia="Arial" w:hAnsi="Arial"/>
+          <w:sz w:val="22"/>
+          <w:szCs w:val="22"/>
+        </w:rPr>
+        <w:t xml:space="preserve">Referral source tracking linked to former client records</w:t>
+      </w:r>
+    </w:p>
+    <w:p>
+      <w:pPr>
+        <w:pStyle w:val="ListParagraph"/>
+        <w:numPr>
+          <w:ilvl w:val="0"/>
+          <w:numId w:val="2"/>
+        </w:numPr>
+        <w:spacing w:after="60"/>
+      </w:pPr>
+      <w:r>
+        <w:rPr>
+          <w:rFonts w:ascii="Arial" w:cs="Arial" w:eastAsia="Arial" w:hAnsi="Arial"/>
+          <w:sz w:val="22"/>
+          <w:szCs w:val="22"/>
+        </w:rPr>
+        <w:t xml:space="preserve">Seasonal outreach campaign management</w:t>
+      </w:r>
+    </w:p>
+    <w:p>
+      <w:pPr>
+        <w:pStyle w:val="Heading3"/>
+      </w:pPr>
+      <w:r>
         <w:t xml:space="preserve">Key Data Categories</w:t>
       </w:r>
     </w:p>
@@ -11292,6 +11585,42 @@
           <w:szCs w:val="22"/>
         </w:rPr>
         <w:t xml:space="preserve">Communication history with prospects and partners</w:t>
+      </w:r>
+    </w:p>
+    <w:p>
+      <w:pPr>
+        <w:pStyle w:val="ListParagraph"/>
+        <w:numPr>
+          <w:ilvl w:val="0"/>
+          <w:numId w:val="2"/>
+        </w:numPr>
+        <w:spacing w:after="60"/>
+      </w:pPr>
+      <w:r>
+        <w:rPr>
+          <w:rFonts w:ascii="Arial" w:cs="Arial" w:eastAsia="Arial" w:hAnsi="Arial"/>
+          <w:sz w:val="22"/>
+          <w:szCs w:val="22"/>
+        </w:rPr>
+        <w:t xml:space="preserve">Alumni and reactivation tracking records</w:t>
+      </w:r>
+    </w:p>
+    <w:p>
+      <w:pPr>
+        <w:pStyle w:val="ListParagraph"/>
+        <w:numPr>
+          <w:ilvl w:val="0"/>
+          <w:numId w:val="2"/>
+        </w:numPr>
+        <w:spacing w:after="60"/>
+      </w:pPr>
+      <w:r>
+        <w:rPr>
+          <w:rFonts w:ascii="Arial" w:cs="Arial" w:eastAsia="Arial" w:hAnsi="Arial"/>
+          <w:sz w:val="22"/>
+          <w:szCs w:val="22"/>
+        </w:rPr>
+        <w:t xml:space="preserve">Event attendee conversion and follow-up records</w:t>
       </w:r>
     </w:p>
     <w:p>

</xml_diff>

<commit_message>
Master PRD v2.3: Add MST-PER-013 (Client) to CR domain persona list
</commit_message>
<xml_diff>
--- a/PRDs/CBM-Master-PRD.docx
+++ b/PRDs/CBM-Master-PRD.docx
@@ -138,7 +138,7 @@
                 <w:sz w:val="20"/>
                 <w:szCs w:val="20"/>
               </w:rPr>
-              <w:t xml:space="preserve">2.2</w:t>
+              <w:t xml:space="preserve">2.3</w:t>
             </w:r>
           </w:p>
         </w:tc>
@@ -256,7 +256,7 @@
                 <w:sz w:val="20"/>
                 <w:szCs w:val="20"/>
               </w:rPr>
-              <w:t xml:space="preserve">04-04-26 20:30</w:t>
+              <w:t xml:space="preserve">04-05-26 19:00</w:t>
             </w:r>
           </w:p>
         </w:tc>
@@ -10363,7 +10363,7 @@
           <w:sz w:val="22"/>
           <w:szCs w:val="22"/>
         </w:rPr>
-        <w:t xml:space="preserve">MST-PER-003 Client Administrator, MST-PER-006 Mentor Recruiter, MST-PER-007 Client Recruiter, MST-PER-008 Partner Coordinator, MST-PER-009 Content and Event Administrator, MST-PER-012 Member</w:t>
+        <w:t xml:space="preserve">MST-PER-003 Client Administrator, MST-PER-006 Mentor Recruiter, MST-PER-007 Client Recruiter, MST-PER-008 Partner Coordinator, MST-PER-009 Content and Event Administrator, MST-PER-012 Member, MST-PER-013 Client</w:t>
       </w:r>
     </w:p>
     <w:p>

</xml_diff>

<commit_message>
Master PRD v2.3 -> v2.4: Add Universal Contact-Creation Rules (5.4)
Adds new Section 5.4 referencing the Universal Contact-Creation Rules
formalized in CR-MARKETING Sub-Domain Overview Section 4.4. The five
rules (optional company fields, hardcoded contactType per form, CSV
import contactType assignment, type-specific creation logic, and
contactType-agnostic Account matching) apply CRM-wide to every
Contact-creation pathway across all domains.

Carry-forward update from CR-MARKETING Sub-Domain Overview v1.0.
</commit_message>
<xml_diff>
--- a/PRDs/CBM-Master-PRD.docx
+++ b/PRDs/CBM-Master-PRD.docx
@@ -133,12 +133,7 @@
           </w:tcPr>
           <w:p>
             <w:r>
-              <w:rPr>
-                <w:rFonts w:ascii="Arial" w:cs="Arial" w:eastAsia="Arial" w:hAnsi="Arial"/>
-                <w:sz w:val="20"/>
-                <w:szCs w:val="20"/>
-              </w:rPr>
-              <w:t xml:space="preserve">2.3</w:t>
+              <w:t>2.4</w:t>
             </w:r>
           </w:p>
         </w:tc>
@@ -251,12 +246,7 @@
           </w:tcPr>
           <w:p>
             <w:r>
-              <w:rPr>
-                <w:rFonts w:ascii="Arial" w:cs="Arial" w:eastAsia="Arial" w:hAnsi="Arial"/>
-                <w:sz w:val="20"/>
-                <w:szCs w:val="20"/>
-              </w:rPr>
-              <w:t xml:space="preserve">04-05-26 19:00</w:t>
+              <w:t>04-08-26 13:53</w:t>
             </w:r>
           </w:p>
         </w:tc>
@@ -14059,6 +14049,94 @@
         <w:t xml:space="preserve">The CRM serves as the single source of truth for all contacts known to CBM. Contact lists are maintained in the CRM and synchronized to the outbound marketing system for campaign delivery. Campaign engagement history is recorded back into the CRM against each contact record, ensuring a complete picture of every interaction CBM has had with each individual regardless of channel.</w:t>
       </w:r>
     </w:p>
+    <w:p>
+      <w:pPr>
+        <w:pStyle w:val="Heading2"/>
+      </w:pPr>
+      <w:r>
+        <w:t>5.4 Universal Contact-Creation Rules</w:t>
+      </w:r>
+    </w:p>
+    <w:p>
+      <w:r>
+        <w:t>The CRM applies a uniform set of rules to every Contact-creation pathway across all domains. These rules ensure consistency in how Contact records are created, how they are linked to Account records, and how their initial type and lifecycle state are established. The full specification is in the CR-MARKETING Sub-Domain Overview Section 4.4. The rules in summary are:</w:t>
+      </w:r>
+    </w:p>
+    <w:p>
+      <w:pPr>
+        <w:pStyle w:val="ListParagraph"/>
+      </w:pPr>
+      <w:r>
+        <w:rPr>
+          <w:b/>
+        </w:rPr>
+        <w:t xml:space="preserve">Optional company information on every form. </w:t>
+      </w:r>
+      <w:r>
+        <w:t>Every Contact-creation form (web inquiry, event registration, mentor application, partner contact intake, donor signup, etc.) presents two optional fields: company name and company website. The fields are always offered, never required.</w:t>
+      </w:r>
+    </w:p>
+    <w:p>
+      <w:pPr>
+        <w:pStyle w:val="ListParagraph"/>
+      </w:pPr>
+      <w:r>
+        <w:rPr>
+          <w:b/>
+        </w:rPr>
+        <w:t xml:space="preserve">Hardcoded contactType per form. </w:t>
+      </w:r>
+      <w:r>
+        <w:t>The contactType for Contacts created through a given form is determined by the form's configuration, not by user selection. A mentor application form creates Mentor contacts; a client inquiry form creates Client contacts; a partner contact intake form creates Partner contacts.</w:t>
+      </w:r>
+    </w:p>
+    <w:p>
+      <w:pPr>
+        <w:pStyle w:val="ListParagraph"/>
+      </w:pPr>
+      <w:r>
+        <w:rPr>
+          <w:b/>
+        </w:rPr>
+        <w:t xml:space="preserve">CSV imports require explicit contactType assignment. </w:t>
+      </w:r>
+      <w:r>
+        <w:t>Bulk CSV imports either select a contactType for the entire import or read it from a per-row column.</w:t>
+      </w:r>
+    </w:p>
+    <w:p>
+      <w:pPr>
+        <w:pStyle w:val="ListParagraph"/>
+      </w:pPr>
+      <w:r>
+        <w:rPr>
+          <w:b/>
+        </w:rPr>
+        <w:t xml:space="preserve">contactType determines type-specific creation logic. </w:t>
+      </w:r>
+      <w:r>
+        <w:t>Once a Contact is created with a known contactType, type-specific business logic runs as appropriate (lifecycle field initialization, default values, type-specific workflow triggers).</w:t>
+      </w:r>
+    </w:p>
+    <w:p>
+      <w:pPr>
+        <w:pStyle w:val="ListParagraph"/>
+      </w:pPr>
+      <w:r>
+        <w:rPr>
+          <w:b/>
+        </w:rPr>
+        <w:t xml:space="preserve">Account matching is contactType-agnostic. </w:t>
+      </w:r>
+      <w:r>
+        <w:t>When company information is provided, the same Account precedence ladder runs (website match → exact name match → manual or new) regardless of the Contact's contactType. The native Account.website field is the basis for automatic matching.</w:t>
+      </w:r>
+    </w:p>
+    <w:p>
+      <w:r>
+        <w:t>All domains and sub-domains that introduce Contact-creation pathways (CR, MN, MR, FU, plus any cross-domain services) must comply with these rules. The rules apply equally to web forms, CSV imports, single-record manual creation, and any other inbound creation channel.</w:t>
+      </w:r>
+    </w:p>
     <w:sectPr>
       <w:headerReference w:type="default" r:id="rId6"/>
       <w:footerReference w:type="default" r:id="rId7"/>

</xml_diff>

<commit_message>
Master PRD v2.3 -> v2.4: add Section 5.4 Universal Contact-Creation Rules
Adds reference to the Universal Contact-Creation Rules established in
the CR-MARKETING Sub-Domain Overview Section 4.4. The rules apply
CRM-wide to every Contact-creation pathway across all domains.

Five rules summarized in this section:
- Optional company information on every form
- Hardcoded contactType per form (no user selection)
- CSV imports require explicit contactType assignment
- contactType determines type-specific creation logic
- Account matching is contactType-agnostic

Full specification remains in CBM-SubDomain-Overview-Marketing.docx
Section 4.4. Other domains (CR, MN, MR, FU, cross-domain services)
must comply with these rules.

Carry-forward update from CR-MARKETING Sub-Domain Overview v1.0
Section 6 (Updates to Prior Documents).
</commit_message>
<xml_diff>
--- a/PRDs/CBM-Master-PRD.docx
+++ b/PRDs/CBM-Master-PRD.docx
@@ -133,7 +133,12 @@
           </w:tcPr>
           <w:p>
             <w:r>
-              <w:t>2.4</w:t>
+              <w:rPr>
+                <w:rFonts w:ascii="Arial" w:cs="Arial" w:eastAsia="Arial" w:hAnsi="Arial"/>
+                <w:sz w:val="20"/>
+                <w:szCs w:val="20"/>
+              </w:rPr>
+              <w:t xml:space="preserve">2.4</w:t>
             </w:r>
           </w:p>
         </w:tc>
@@ -246,7 +251,12 @@
           </w:tcPr>
           <w:p>
             <w:r>
-              <w:t>04-08-26 13:53</w:t>
+              <w:rPr>
+                <w:rFonts w:ascii="Arial" w:cs="Arial" w:eastAsia="Arial" w:hAnsi="Arial"/>
+                <w:sz w:val="20"/>
+                <w:szCs w:val="20"/>
+              </w:rPr>
+              <w:t xml:space="preserve">04-08-26 04:00</w:t>
             </w:r>
           </w:p>
         </w:tc>
@@ -14054,87 +14064,173 @@
         <w:pStyle w:val="Heading2"/>
       </w:pPr>
       <w:r>
-        <w:t>5.4 Universal Contact-Creation Rules</w:t>
-      </w:r>
-    </w:p>
-    <w:p>
-      <w:r>
-        <w:t>The CRM applies a uniform set of rules to every Contact-creation pathway across all domains. These rules ensure consistency in how Contact records are created, how they are linked to Account records, and how their initial type and lifecycle state are established. The full specification is in the CR-MARKETING Sub-Domain Overview Section 4.4. The rules in summary are:</w:t>
-      </w:r>
-    </w:p>
-    <w:p>
-      <w:pPr>
-        <w:pStyle w:val="ListParagraph"/>
-      </w:pPr>
-      <w:r>
-        <w:rPr>
+        <w:t xml:space="preserve">5.4 Universal Contact-Creation Rules</w:t>
+      </w:r>
+    </w:p>
+    <w:p>
+      <w:pPr>
+        <w:spacing w:after="120"/>
+      </w:pPr>
+      <w:r>
+        <w:rPr>
+          <w:rFonts w:ascii="Arial" w:cs="Arial" w:eastAsia="Arial" w:hAnsi="Arial"/>
+          <w:sz w:val="22"/>
+          <w:szCs w:val="22"/>
+        </w:rPr>
+        <w:t xml:space="preserve">The CRM applies a uniform set of rules to every Contact-creation pathway across all domains. These rules ensure consistency in how Contact records are created, how they are linked to Account records, and how their initial type and lifecycle state are established. The full specification is in the CR-MARKETING Sub-Domain Overview Section 4.4. The rules in summary are:</w:t>
+      </w:r>
+    </w:p>
+    <w:p>
+      <w:pPr>
+        <w:pStyle w:val="ListParagraph"/>
+        <w:numPr>
+          <w:ilvl w:val="0"/>
+          <w:numId w:val="2"/>
+        </w:numPr>
+        <w:spacing w:after="40"/>
+      </w:pPr>
+      <w:r>
+        <w:rPr>
+          <w:rFonts w:ascii="Arial" w:cs="Arial" w:eastAsia="Arial" w:hAnsi="Arial"/>
           <w:b/>
+          <w:bCs/>
+          <w:sz w:val="22"/>
+          <w:szCs w:val="22"/>
         </w:rPr>
         <w:t xml:space="preserve">Optional company information on every form. </w:t>
       </w:r>
       <w:r>
-        <w:t>Every Contact-creation form (web inquiry, event registration, mentor application, partner contact intake, donor signup, etc.) presents two optional fields: company name and company website. The fields are always offered, never required.</w:t>
-      </w:r>
-    </w:p>
-    <w:p>
-      <w:pPr>
-        <w:pStyle w:val="ListParagraph"/>
-      </w:pPr>
-      <w:r>
-        <w:rPr>
+        <w:rPr>
+          <w:rFonts w:ascii="Arial" w:cs="Arial" w:eastAsia="Arial" w:hAnsi="Arial"/>
+          <w:sz w:val="22"/>
+          <w:szCs w:val="22"/>
+        </w:rPr>
+        <w:t xml:space="preserve">Every Contact-creation form (web inquiry, event registration, mentor application, partner contact intake, donor signup, etc.) presents two optional fields: company name and company website. The fields are always offered, never required.</w:t>
+      </w:r>
+    </w:p>
+    <w:p>
+      <w:pPr>
+        <w:pStyle w:val="ListParagraph"/>
+        <w:numPr>
+          <w:ilvl w:val="0"/>
+          <w:numId w:val="2"/>
+        </w:numPr>
+        <w:spacing w:after="40"/>
+      </w:pPr>
+      <w:r>
+        <w:rPr>
+          <w:rFonts w:ascii="Arial" w:cs="Arial" w:eastAsia="Arial" w:hAnsi="Arial"/>
           <w:b/>
+          <w:bCs/>
+          <w:sz w:val="22"/>
+          <w:szCs w:val="22"/>
         </w:rPr>
         <w:t xml:space="preserve">Hardcoded contactType per form. </w:t>
       </w:r>
       <w:r>
-        <w:t>The contactType for Contacts created through a given form is determined by the form's configuration, not by user selection. A mentor application form creates Mentor contacts; a client inquiry form creates Client contacts; a partner contact intake form creates Partner contacts.</w:t>
-      </w:r>
-    </w:p>
-    <w:p>
-      <w:pPr>
-        <w:pStyle w:val="ListParagraph"/>
-      </w:pPr>
-      <w:r>
-        <w:rPr>
+        <w:rPr>
+          <w:rFonts w:ascii="Arial" w:cs="Arial" w:eastAsia="Arial" w:hAnsi="Arial"/>
+          <w:sz w:val="22"/>
+          <w:szCs w:val="22"/>
+        </w:rPr>
+        <w:t xml:space="preserve">The contactType for Contacts created through a given form is determined by the form’s configuration, not by user selection. A mentor application form creates Mentor contacts; a client inquiry form creates Client contacts; a partner contact intake form creates Partner contacts.</w:t>
+      </w:r>
+    </w:p>
+    <w:p>
+      <w:pPr>
+        <w:pStyle w:val="ListParagraph"/>
+        <w:numPr>
+          <w:ilvl w:val="0"/>
+          <w:numId w:val="2"/>
+        </w:numPr>
+        <w:spacing w:after="40"/>
+      </w:pPr>
+      <w:r>
+        <w:rPr>
+          <w:rFonts w:ascii="Arial" w:cs="Arial" w:eastAsia="Arial" w:hAnsi="Arial"/>
           <w:b/>
+          <w:bCs/>
+          <w:sz w:val="22"/>
+          <w:szCs w:val="22"/>
         </w:rPr>
         <w:t xml:space="preserve">CSV imports require explicit contactType assignment. </w:t>
       </w:r>
       <w:r>
-        <w:t>Bulk CSV imports either select a contactType for the entire import or read it from a per-row column.</w:t>
-      </w:r>
-    </w:p>
-    <w:p>
-      <w:pPr>
-        <w:pStyle w:val="ListParagraph"/>
-      </w:pPr>
-      <w:r>
-        <w:rPr>
+        <w:rPr>
+          <w:rFonts w:ascii="Arial" w:cs="Arial" w:eastAsia="Arial" w:hAnsi="Arial"/>
+          <w:sz w:val="22"/>
+          <w:szCs w:val="22"/>
+        </w:rPr>
+        <w:t xml:space="preserve">Bulk CSV imports either select a contactType for the entire import or read it from a per-row column.</w:t>
+      </w:r>
+    </w:p>
+    <w:p>
+      <w:pPr>
+        <w:pStyle w:val="ListParagraph"/>
+        <w:numPr>
+          <w:ilvl w:val="0"/>
+          <w:numId w:val="2"/>
+        </w:numPr>
+        <w:spacing w:after="40"/>
+      </w:pPr>
+      <w:r>
+        <w:rPr>
+          <w:rFonts w:ascii="Arial" w:cs="Arial" w:eastAsia="Arial" w:hAnsi="Arial"/>
           <w:b/>
+          <w:bCs/>
+          <w:sz w:val="22"/>
+          <w:szCs w:val="22"/>
         </w:rPr>
         <w:t xml:space="preserve">contactType determines type-specific creation logic. </w:t>
       </w:r>
       <w:r>
-        <w:t>Once a Contact is created with a known contactType, type-specific business logic runs as appropriate (lifecycle field initialization, default values, type-specific workflow triggers).</w:t>
-      </w:r>
-    </w:p>
-    <w:p>
-      <w:pPr>
-        <w:pStyle w:val="ListParagraph"/>
-      </w:pPr>
-      <w:r>
-        <w:rPr>
+        <w:rPr>
+          <w:rFonts w:ascii="Arial" w:cs="Arial" w:eastAsia="Arial" w:hAnsi="Arial"/>
+          <w:sz w:val="22"/>
+          <w:szCs w:val="22"/>
+        </w:rPr>
+        <w:t xml:space="preserve">Once a Contact is created with a known contactType, type-specific business logic runs as appropriate (lifecycle field initialization, default values, type-specific workflow triggers).</w:t>
+      </w:r>
+    </w:p>
+    <w:p>
+      <w:pPr>
+        <w:pStyle w:val="ListParagraph"/>
+        <w:numPr>
+          <w:ilvl w:val="0"/>
+          <w:numId w:val="2"/>
+        </w:numPr>
+        <w:spacing w:after="40"/>
+      </w:pPr>
+      <w:r>
+        <w:rPr>
+          <w:rFonts w:ascii="Arial" w:cs="Arial" w:eastAsia="Arial" w:hAnsi="Arial"/>
           <w:b/>
+          <w:bCs/>
+          <w:sz w:val="22"/>
+          <w:szCs w:val="22"/>
         </w:rPr>
         <w:t xml:space="preserve">Account matching is contactType-agnostic. </w:t>
       </w:r>
       <w:r>
-        <w:t>When company information is provided, the same Account precedence ladder runs (website match → exact name match → manual or new) regardless of the Contact's contactType. The native Account.website field is the basis for automatic matching.</w:t>
-      </w:r>
-    </w:p>
-    <w:p>
-      <w:r>
-        <w:t>All domains and sub-domains that introduce Contact-creation pathways (CR, MN, MR, FU, plus any cross-domain services) must comply with these rules. The rules apply equally to web forms, CSV imports, single-record manual creation, and any other inbound creation channel.</w:t>
+        <w:rPr>
+          <w:rFonts w:ascii="Arial" w:cs="Arial" w:eastAsia="Arial" w:hAnsi="Arial"/>
+          <w:sz w:val="22"/>
+          <w:szCs w:val="22"/>
+        </w:rPr>
+        <w:t xml:space="preserve">When company information is provided, the same Account precedence ladder runs (website match → exact name match → manual or new) regardless of the Contact’s contactType. The native Account.website field is the basis for automatic matching.</w:t>
+      </w:r>
+    </w:p>
+    <w:p>
+      <w:pPr>
+        <w:spacing w:after="120"/>
+      </w:pPr>
+      <w:r>
+        <w:rPr>
+          <w:rFonts w:ascii="Arial" w:cs="Arial" w:eastAsia="Arial" w:hAnsi="Arial"/>
+          <w:sz w:val="22"/>
+          <w:szCs w:val="22"/>
+        </w:rPr>
+        <w:t xml:space="preserve">All domains and sub-domains that introduce Contact-creation pathways (CR, MN, MR, FU, plus any cross-domain services) must comply with these rules. The rules apply equally to web forms, CSV imports, single-record manual creation, and any other inbound creation channel.</w:t>
       </w:r>
     </w:p>
     <w:sectPr>

</xml_diff>

<commit_message>
Master PRD v2.4 → v2.5: remove exact-name-match step from Universal Contact-Creation Rules ladder
Universal Contact-Creation Rules summary, Rule 5 (Account matching is
contactType-agnostic): ladder phrase shortened from
(website match → exact name match → manual or new) to
(website match → manual or new). Added clarifying sentence noting
the website is the only signal trusted for automatic linking and
that name-based linking is not performed because two unrelated firms
can share a name.

This is a CRM-wide rule change. The CR-MARKETING Sub-Domain Overview
v1.1 carries the operational detail; this Master PRD update keeps the
top-level principle in sync.

Header bumps: Version 2.5, Last Updated 04-09-26 10:05.
</commit_message>
<xml_diff>
--- a/PRDs/CBM-Master-PRD.docx
+++ b/PRDs/CBM-Master-PRD.docx
@@ -138,7 +138,7 @@
                 <w:sz w:val="20"/>
                 <w:szCs w:val="20"/>
               </w:rPr>
-              <w:t xml:space="preserve">2.4</w:t>
+              <w:t xml:space="preserve">2.5</w:t>
             </w:r>
           </w:p>
         </w:tc>
@@ -256,7 +256,7 @@
                 <w:sz w:val="20"/>
                 <w:szCs w:val="20"/>
               </w:rPr>
-              <w:t xml:space="preserve">04-08-26 04:00</w:t>
+              <w:t xml:space="preserve">04-09-26 10:05</w:t>
             </w:r>
           </w:p>
         </w:tc>
@@ -14217,7 +14217,7 @@
           <w:sz w:val="22"/>
           <w:szCs w:val="22"/>
         </w:rPr>
-        <w:t xml:space="preserve">When company information is provided, the same Account precedence ladder runs (website match → exact name match → manual or new) regardless of the Contact’s contactType. The native Account.website field is the basis for automatic matching.</w:t>
+        <w:t xml:space="preserve">When company information is provided, the same Account precedence ladder runs (website match → manual or new) regardless of the Contact’s contactType. The native Account.website field is the basis for automatic matching, and is the only signal trusted for automatic linking — name-based linking is not performed because two unrelated firms can share a name.</w:t>
       </w:r>
     </w:p>
     <w:p>

</xml_diff>

<commit_message>
Master PRD v2.6: introduce MST-SVC-NNN service codes
Add master ID and code to all four Cross-Domain Service headings to
match the established MST-PER-NNN persona and MST-DOM-NNN domain
conventions:

  4.1 MST-SVC-001 — Notes Service (NOTES)
  4.2 MST-SVC-002 — Email Service (EMAIL)
  4.3 MST-SVC-003 — Calendar Service (CALENDAR)
  4.4 MST-SVC-004 — Survey Service (SURVEY)

Rationale: makes the Master PRD the single source of truth for
service codes (previously the importer synthesized them) and lets
the new docx-to-payload adapter parse services with the same
heading regex as top-level domains.

Version: 2.5 → 2.6
Last Updated: 04-09-26 10:05 → 04-10-26 14:30
</commit_message>
<xml_diff>
--- a/PRDs/CBM-Master-PRD.docx
+++ b/PRDs/CBM-Master-PRD.docx
@@ -138,7 +138,7 @@
                 <w:sz w:val="20"/>
                 <w:szCs w:val="20"/>
               </w:rPr>
-              <w:t xml:space="preserve">2.5</w:t>
+              <w:t>2.6</w:t>
             </w:r>
           </w:p>
         </w:tc>
@@ -256,7 +256,7 @@
                 <w:sz w:val="20"/>
                 <w:szCs w:val="20"/>
               </w:rPr>
-              <w:t xml:space="preserve">04-09-26 10:05</w:t>
+              <w:t>04-10-26 14:30</w:t>
             </w:r>
           </w:p>
         </w:tc>
@@ -12820,7 +12820,7 @@
         <w:pStyle w:val="Heading2"/>
       </w:pPr>
       <w:r>
-        <w:t xml:space="preserve">4.1 Notes Service</w:t>
+        <w:t>4.1 MST-SVC-001 — Notes Service (NOTES)</w:t>
       </w:r>
     </w:p>
     <w:p>
@@ -12971,7 +12971,7 @@
         <w:pStyle w:val="Heading2"/>
       </w:pPr>
       <w:r>
-        <w:t xml:space="preserve">4.2 Email Service</w:t>
+        <w:t>4.2 MST-SVC-002 — Email Service (EMAIL)</w:t>
       </w:r>
     </w:p>
     <w:p>
@@ -13122,7 +13122,7 @@
         <w:pStyle w:val="Heading2"/>
       </w:pPr>
       <w:r>
-        <w:t xml:space="preserve">4.3 Calendar Service</w:t>
+        <w:t>4.3 MST-SVC-003 — Calendar Service (CALENDAR)</w:t>
       </w:r>
     </w:p>
     <w:p>
@@ -13255,7 +13255,7 @@
         <w:pStyle w:val="Heading2"/>
       </w:pPr>
       <w:r>
-        <w:t xml:space="preserve">4.4 Survey Service</w:t>
+        <w:t>4.4 MST-SVC-004 — Survey Service (SURVEY)</w:t>
       </w:r>
     </w:p>
     <w:p>

</xml_diff>